<commit_message>
formulier pepijn en damien
</commit_message>
<xml_diff>
--- a/evaluatie/Evaluatieformulier pepijn.docx
+++ b/evaluatie/Evaluatieformulier pepijn.docx
@@ -1,10 +1,10 @@
 
 <file path=word/document.xml><?xml version="1.0" encoding="utf-8"?>
-<w:document xmlns:wpc="http://schemas.microsoft.com/office/word/2010/wordprocessingCanvas" xmlns:cx="http://schemas.microsoft.com/office/drawing/2014/chartex" xmlns:cx1="http://schemas.microsoft.com/office/drawing/2015/9/8/chartex" xmlns:cx2="http://schemas.microsoft.com/office/drawing/2015/10/21/chartex" xmlns:cx3="http://schemas.microsoft.com/office/drawing/2016/5/9/chartex" xmlns:cx4="http://schemas.microsoft.com/office/drawing/2016/5/10/chartex" xmlns:cx5="http://schemas.microsoft.com/office/drawing/2016/5/11/chartex" xmlns:cx6="http://schemas.microsoft.com/office/drawing/2016/5/12/chartex" xmlns:cx7="http://schemas.microsoft.com/office/drawing/2016/5/13/chartex" xmlns:cx8="http://schemas.microsoft.com/office/drawing/2016/5/14/chartex" xmlns:mc="http://schemas.openxmlformats.org/markup-compatibility/2006" xmlns:m="http://schemas.openxmlformats.org/officeDocument/2006/math" xmlns:aink="http://schemas.microsoft.com/office/drawing/2016/ink" xmlns:am3d="http://schemas.microsoft.com/office/drawing/2017/model3d" xmlns:oel="http://schemas.microsoft.com/office/2019/extlst" xmlns:r="http://schemas.openxmlformats.org/officeDocument/2006/relationships" xmlns:wp14="http://schemas.microsoft.com/office/word/2010/wordprocessingDrawing" xmlns:wp="http://schemas.openxmlformats.org/drawingml/2006/wordprocessingDrawing" xmlns:wpg="http://schemas.microsoft.com/office/word/2010/wordprocessingGroup" xmlns:wpi="http://schemas.microsoft.com/office/word/2010/wordprocessingInk" xmlns:wps="http://schemas.microsoft.com/office/word/2010/wordprocessingShape" xmlns:o="urn:schemas-microsoft-com:office:office" xmlns:v="urn:schemas-microsoft-com:vml" xmlns:w10="urn:schemas-microsoft-com:office:word" xmlns:w="http://schemas.openxmlformats.org/wordprocessingml/2006/main" xmlns:w14="http://schemas.microsoft.com/office/word/2010/wordml" xmlns:w15="http://schemas.microsoft.com/office/word/2012/wordml" xmlns:w16cex="http://schemas.microsoft.com/office/word/2018/wordml/cex" xmlns:w16cid="http://schemas.microsoft.com/office/word/2016/wordml/cid" xmlns:w16="http://schemas.microsoft.com/office/word/2018/wordml" xmlns:w16sdtdh="http://schemas.microsoft.com/office/word/2020/wordml/sdtdatahash" xmlns:w16sdtfl="http://schemas.microsoft.com/office/word/2024/wordml/sdtformatlock" xmlns:w16se="http://schemas.microsoft.com/office/word/2015/wordml/symex" xmlns:w16du="http://schemas.microsoft.com/office/word/2023/wordml/word16du" xmlns:wne="http://schemas.microsoft.com/office/word/2006/wordml" mc:Ignorable="w14 w15 w16se w16cid w16 w16cex w16sdtdh w16sdtfl w16du wp14">
+<w:document xmlns:wpc="http://schemas.microsoft.com/office/word/2010/wordprocessingCanvas" xmlns:cx="http://schemas.microsoft.com/office/drawing/2014/chartex" xmlns:cx1="http://schemas.microsoft.com/office/drawing/2015/9/8/chartex" xmlns:cx2="http://schemas.microsoft.com/office/drawing/2015/10/21/chartex" xmlns:cx3="http://schemas.microsoft.com/office/drawing/2016/5/9/chartex" xmlns:cx4="http://schemas.microsoft.com/office/drawing/2016/5/10/chartex" xmlns:cx5="http://schemas.microsoft.com/office/drawing/2016/5/11/chartex" xmlns:cx6="http://schemas.microsoft.com/office/drawing/2016/5/12/chartex" xmlns:cx7="http://schemas.microsoft.com/office/drawing/2016/5/13/chartex" xmlns:cx8="http://schemas.microsoft.com/office/drawing/2016/5/14/chartex" xmlns:mc="http://schemas.openxmlformats.org/markup-compatibility/2006" xmlns:aink="http://schemas.microsoft.com/office/drawing/2016/ink" xmlns:am3d="http://schemas.microsoft.com/office/drawing/2017/model3d" xmlns:o="urn:schemas-microsoft-com:office:office" xmlns:oel="http://schemas.microsoft.com/office/2019/extlst" xmlns:r="http://schemas.openxmlformats.org/officeDocument/2006/relationships" xmlns:m="http://schemas.openxmlformats.org/officeDocument/2006/math" xmlns:v="urn:schemas-microsoft-com:vml" xmlns:wp14="http://schemas.microsoft.com/office/word/2010/wordprocessingDrawing" xmlns:wp="http://schemas.openxmlformats.org/drawingml/2006/wordprocessingDrawing" xmlns:w10="urn:schemas-microsoft-com:office:word" xmlns:w="http://schemas.openxmlformats.org/wordprocessingml/2006/main" xmlns:w14="http://schemas.microsoft.com/office/word/2010/wordml" xmlns:w15="http://schemas.microsoft.com/office/word/2012/wordml" xmlns:w16cex="http://schemas.microsoft.com/office/word/2018/wordml/cex" xmlns:w16cid="http://schemas.microsoft.com/office/word/2016/wordml/cid" xmlns:w16="http://schemas.microsoft.com/office/word/2018/wordml" xmlns:w16du="http://schemas.microsoft.com/office/word/2023/wordml/word16du" xmlns:w16sdtdh="http://schemas.microsoft.com/office/word/2020/wordml/sdtdatahash" xmlns:w16sdtfl="http://schemas.microsoft.com/office/word/2024/wordml/sdtformatlock" xmlns:w16se="http://schemas.microsoft.com/office/word/2015/wordml/symex" xmlns:wpg="http://schemas.microsoft.com/office/word/2010/wordprocessingGroup" xmlns:wpi="http://schemas.microsoft.com/office/word/2010/wordprocessingInk" xmlns:wne="http://schemas.microsoft.com/office/word/2006/wordml" xmlns:wps="http://schemas.microsoft.com/office/word/2010/wordprocessingShape" mc:Ignorable="w14 w15 w16se w16cid w16 w16cex w16sdtdh w16sdtfl w16du wp14">
   <w:body>
     <w:p>
       <w:pPr>
-        <w:pStyle w:val="Heading1"/>
+        <w:pStyle w:val="Kop1"/>
         <w:rPr>
           <w:lang w:val="nl-NL"/>
         </w:rPr>
@@ -39,6 +39,24 @@
         </w:rPr>
         <w:t>Naam:</w:t>
       </w:r>
+      <w:r>
+        <w:rPr>
+          <w:b/>
+          <w:bCs/>
+          <w:lang w:val="nl-NL"/>
+        </w:rPr>
+        <w:t xml:space="preserve"> </w:t>
+      </w:r>
+      <w:proofErr w:type="spellStart"/>
+      <w:r>
+        <w:rPr>
+          <w:b/>
+          <w:bCs/>
+          <w:lang w:val="nl-NL"/>
+        </w:rPr>
+        <w:t>pepijn</w:t>
+      </w:r>
+      <w:proofErr w:type="spellEnd"/>
     </w:p>
     <w:p>
       <w:pPr>
@@ -55,6 +73,14 @@
           <w:lang w:val="nl-NL"/>
         </w:rPr>
         <w:t>Evalueert groep:</w:t>
+      </w:r>
+      <w:r>
+        <w:rPr>
+          <w:b/>
+          <w:bCs/>
+          <w:lang w:val="nl-NL"/>
+        </w:rPr>
+        <w:t xml:space="preserve"> thomas</w:t>
       </w:r>
     </w:p>
     <w:p>
@@ -96,12 +122,40 @@
         <w:rPr>
           <w:lang w:val="nl-NL"/>
         </w:rPr>
-        <w:t>Dit doen we in een aantal stappen. We beginnen met de System Usability Scale in stap 1.</w:t>
+        <w:t xml:space="preserve">Dit doen we in een aantal stappen. We beginnen met de System </w:t>
+      </w:r>
+      <w:proofErr w:type="spellStart"/>
+      <w:r>
+        <w:rPr>
+          <w:lang w:val="nl-NL"/>
+        </w:rPr>
+        <w:t>Usability</w:t>
+      </w:r>
+      <w:proofErr w:type="spellEnd"/>
+      <w:r>
+        <w:rPr>
+          <w:lang w:val="nl-NL"/>
+        </w:rPr>
+        <w:t xml:space="preserve"> </w:t>
+      </w:r>
+      <w:proofErr w:type="spellStart"/>
+      <w:r>
+        <w:rPr>
+          <w:lang w:val="nl-NL"/>
+        </w:rPr>
+        <w:t>Scale</w:t>
+      </w:r>
+      <w:proofErr w:type="spellEnd"/>
+      <w:r>
+        <w:rPr>
+          <w:lang w:val="nl-NL"/>
+        </w:rPr>
+        <w:t xml:space="preserve"> in stap 1.</w:t>
       </w:r>
     </w:p>
     <w:p>
       <w:pPr>
-        <w:pStyle w:val="Heading2"/>
+        <w:pStyle w:val="Kop2"/>
         <w:rPr>
           <w:lang w:val="nl-NL"/>
         </w:rPr>
@@ -153,7 +207,7 @@
     </w:p>
     <w:tbl>
       <w:tblPr>
-        <w:tblStyle w:val="PlainTable2"/>
+        <w:tblStyle w:val="Onopgemaaktetabel2"/>
         <w:tblW w:w="9360" w:type="dxa"/>
         <w:tblLook w:val="0000" w:firstRow="0" w:lastRow="0" w:firstColumn="0" w:lastColumn="0" w:noHBand="0" w:noVBand="0"/>
       </w:tblPr>
@@ -379,6 +433,14 @@
                 <w:lang w:val="nl-NL"/>
               </w:rPr>
             </w:pPr>
+            <w:proofErr w:type="gramStart"/>
+            <w:r>
+              <w:rPr>
+                <w:lang w:val="nl-NL"/>
+              </w:rPr>
+              <w:t>x</w:t>
+            </w:r>
+            <w:proofErr w:type="gramEnd"/>
           </w:p>
         </w:tc>
         <w:tc>
@@ -466,6 +528,14 @@
                 <w:lang w:val="nl-NL"/>
               </w:rPr>
             </w:pPr>
+            <w:proofErr w:type="gramStart"/>
+            <w:r>
+              <w:rPr>
+                <w:lang w:val="nl-NL"/>
+              </w:rPr>
+              <w:t>x</w:t>
+            </w:r>
+            <w:proofErr w:type="gramEnd"/>
           </w:p>
         </w:tc>
         <w:tc>
@@ -565,6 +635,14 @@
                 <w:lang w:val="nl-NL"/>
               </w:rPr>
             </w:pPr>
+            <w:proofErr w:type="gramStart"/>
+            <w:r>
+              <w:rPr>
+                <w:lang w:val="nl-NL"/>
+              </w:rPr>
+              <w:t>x</w:t>
+            </w:r>
+            <w:proofErr w:type="gramEnd"/>
           </w:p>
         </w:tc>
         <w:tc>
@@ -632,11 +710,18 @@
           <w:p>
             <w:pPr>
               <w:spacing w:after="30"/>
-              <w:jc w:val="center"/>
-              <w:rPr>
-                <w:lang w:val="nl-NL"/>
-              </w:rPr>
-            </w:pPr>
+              <w:rPr>
+                <w:lang w:val="nl-NL"/>
+              </w:rPr>
+            </w:pPr>
+            <w:proofErr w:type="gramStart"/>
+            <w:r>
+              <w:rPr>
+                <w:lang w:val="nl-NL"/>
+              </w:rPr>
+              <w:t>x</w:t>
+            </w:r>
+            <w:proofErr w:type="gramEnd"/>
           </w:p>
         </w:tc>
         <w:tc>
@@ -766,6 +851,14 @@
                 <w:lang w:val="nl-NL"/>
               </w:rPr>
             </w:pPr>
+            <w:proofErr w:type="gramStart"/>
+            <w:r>
+              <w:rPr>
+                <w:lang w:val="nl-NL"/>
+              </w:rPr>
+              <w:t>x</w:t>
+            </w:r>
+            <w:proofErr w:type="gramEnd"/>
           </w:p>
         </w:tc>
         <w:tc>
@@ -883,6 +976,14 @@
                 <w:lang w:val="nl-NL"/>
               </w:rPr>
             </w:pPr>
+            <w:proofErr w:type="gramStart"/>
+            <w:r>
+              <w:rPr>
+                <w:lang w:val="nl-NL"/>
+              </w:rPr>
+              <w:t>x</w:t>
+            </w:r>
+            <w:proofErr w:type="gramEnd"/>
           </w:p>
         </w:tc>
         <w:tc>
@@ -997,6 +1098,14 @@
                 <w:lang w:val="nl-NL"/>
               </w:rPr>
             </w:pPr>
+            <w:proofErr w:type="gramStart"/>
+            <w:r>
+              <w:rPr>
+                <w:lang w:val="nl-NL"/>
+              </w:rPr>
+              <w:t>x</w:t>
+            </w:r>
+            <w:proofErr w:type="gramEnd"/>
           </w:p>
         </w:tc>
       </w:tr>
@@ -1039,6 +1148,14 @@
                 <w:lang w:val="nl-NL"/>
               </w:rPr>
             </w:pPr>
+            <w:proofErr w:type="gramStart"/>
+            <w:r>
+              <w:rPr>
+                <w:lang w:val="nl-NL"/>
+              </w:rPr>
+              <w:t>x</w:t>
+            </w:r>
+            <w:proofErr w:type="gramEnd"/>
           </w:p>
         </w:tc>
         <w:tc>
@@ -1198,6 +1315,14 @@
                 <w:lang w:val="nl-NL"/>
               </w:rPr>
             </w:pPr>
+            <w:proofErr w:type="gramStart"/>
+            <w:r>
+              <w:rPr>
+                <w:lang w:val="nl-NL"/>
+              </w:rPr>
+              <w:t>x</w:t>
+            </w:r>
+            <w:proofErr w:type="gramEnd"/>
           </w:p>
         </w:tc>
       </w:tr>
@@ -1285,6 +1410,14 @@
                 <w:lang w:val="nl-NL"/>
               </w:rPr>
             </w:pPr>
+            <w:proofErr w:type="gramStart"/>
+            <w:r>
+              <w:rPr>
+                <w:lang w:val="nl-NL"/>
+              </w:rPr>
+              <w:t>x</w:t>
+            </w:r>
+            <w:proofErr w:type="gramEnd"/>
           </w:p>
         </w:tc>
         <w:tc>
@@ -1371,7 +1504,23 @@
           <w:bCs/>
           <w:lang w:val="nl-NL"/>
         </w:rPr>
-        <w:t xml:space="preserve">Mijn SUS-score: </w:t>
+        <w:t>Mijn SUS-score:</w:t>
+      </w:r>
+      <w:r>
+        <w:rPr>
+          <w:b/>
+          <w:bCs/>
+          <w:lang w:val="nl-NL"/>
+        </w:rPr>
+        <w:t xml:space="preserve"> 72.5/100</w:t>
+      </w:r>
+      <w:r>
+        <w:rPr>
+          <w:b/>
+          <w:bCs/>
+          <w:lang w:val="nl-NL"/>
+        </w:rPr>
+        <w:t xml:space="preserve"> </w:t>
       </w:r>
     </w:p>
     <w:p>
@@ -1389,7 +1538,7 @@
     </w:p>
     <w:p>
       <w:pPr>
-        <w:pStyle w:val="Heading2"/>
+        <w:pStyle w:val="Kop2"/>
         <w:rPr>
           <w:lang w:val="nl-NL"/>
         </w:rPr>
@@ -1528,7 +1677,7 @@
     </w:p>
     <w:tbl>
       <w:tblPr>
-        <w:tblStyle w:val="GridTable1Light"/>
+        <w:tblStyle w:val="Rastertabel1licht"/>
         <w:tblW w:w="9360" w:type="dxa"/>
         <w:tblLook w:val="0000" w:firstRow="0" w:lastRow="0" w:firstColumn="0" w:lastColumn="0" w:noHBand="0" w:noVBand="0"/>
       </w:tblPr>
@@ -1623,8 +1772,39 @@
                 <w:sz w:val="18"/>
                 <w:szCs w:val="18"/>
               </w:rPr>
-              <w:t>1. De haastige gebruiker</w:t>
-            </w:r>
+              <w:t xml:space="preserve">1. De </w:t>
+            </w:r>
+            <w:proofErr w:type="spellStart"/>
+            <w:r>
+              <w:rPr>
+                <w:b/>
+                <w:bCs/>
+                <w:sz w:val="18"/>
+                <w:szCs w:val="18"/>
+              </w:rPr>
+              <w:t>haastige</w:t>
+            </w:r>
+            <w:proofErr w:type="spellEnd"/>
+            <w:r>
+              <w:rPr>
+                <w:b/>
+                <w:bCs/>
+                <w:sz w:val="18"/>
+                <w:szCs w:val="18"/>
+              </w:rPr>
+              <w:t xml:space="preserve"> </w:t>
+            </w:r>
+            <w:proofErr w:type="spellStart"/>
+            <w:r>
+              <w:rPr>
+                <w:b/>
+                <w:bCs/>
+                <w:sz w:val="18"/>
+                <w:szCs w:val="18"/>
+              </w:rPr>
+              <w:t>gebruiker</w:t>
+            </w:r>
+            <w:proofErr w:type="spellEnd"/>
           </w:p>
         </w:tc>
         <w:tc>
@@ -1664,12 +1844,53 @@
               </w:rPr>
               <w:t xml:space="preserve">Kan ik de taak afronden zonder iets te lezen? Is de belangrijkste knop meteen te vinden? </w:t>
             </w:r>
-            <w:r>
-              <w:rPr>
-                <w:sz w:val="18"/>
-                <w:szCs w:val="18"/>
-              </w:rPr>
-              <w:t>Zijn er onnodige tussenstappen?</w:t>
+            <w:proofErr w:type="spellStart"/>
+            <w:r>
+              <w:rPr>
+                <w:sz w:val="18"/>
+                <w:szCs w:val="18"/>
+              </w:rPr>
+              <w:t>Zijn</w:t>
+            </w:r>
+            <w:proofErr w:type="spellEnd"/>
+            <w:r>
+              <w:rPr>
+                <w:sz w:val="18"/>
+                <w:szCs w:val="18"/>
+              </w:rPr>
+              <w:t xml:space="preserve"> er </w:t>
+            </w:r>
+            <w:proofErr w:type="spellStart"/>
+            <w:r>
+              <w:rPr>
+                <w:sz w:val="18"/>
+                <w:szCs w:val="18"/>
+              </w:rPr>
+              <w:t>onnodige</w:t>
+            </w:r>
+            <w:proofErr w:type="spellEnd"/>
+            <w:r>
+              <w:rPr>
+                <w:sz w:val="18"/>
+                <w:szCs w:val="18"/>
+              </w:rPr>
+              <w:t xml:space="preserve"> </w:t>
+            </w:r>
+            <w:proofErr w:type="spellStart"/>
+            <w:r>
+              <w:rPr>
+                <w:sz w:val="18"/>
+                <w:szCs w:val="18"/>
+              </w:rPr>
+              <w:t>tussenstappen</w:t>
+            </w:r>
+            <w:proofErr w:type="spellEnd"/>
+            <w:r>
+              <w:rPr>
+                <w:sz w:val="18"/>
+                <w:szCs w:val="18"/>
+              </w:rPr>
+              <w:t>?</w:t>
             </w:r>
           </w:p>
         </w:tc>
@@ -1690,7 +1911,27 @@
                 <w:sz w:val="18"/>
                 <w:szCs w:val="18"/>
               </w:rPr>
-              <w:t>2. De onzekere beginner</w:t>
+              <w:t xml:space="preserve">2. De </w:t>
+            </w:r>
+            <w:proofErr w:type="spellStart"/>
+            <w:r>
+              <w:rPr>
+                <w:b/>
+                <w:bCs/>
+                <w:sz w:val="18"/>
+                <w:szCs w:val="18"/>
+              </w:rPr>
+              <w:t>onzekere</w:t>
+            </w:r>
+            <w:proofErr w:type="spellEnd"/>
+            <w:r>
+              <w:rPr>
+                <w:b/>
+                <w:bCs/>
+                <w:sz w:val="18"/>
+                <w:szCs w:val="18"/>
+              </w:rPr>
+              <w:t xml:space="preserve"> beginner</w:t>
             </w:r>
           </w:p>
         </w:tc>
@@ -1736,7 +1977,87 @@
                 <w:sz w:val="18"/>
                 <w:szCs w:val="18"/>
               </w:rPr>
-              <w:t>Snap ik wat er gebeurt als ik klik?</w:t>
+              <w:t xml:space="preserve">Snap </w:t>
+            </w:r>
+            <w:proofErr w:type="spellStart"/>
+            <w:r>
+              <w:rPr>
+                <w:sz w:val="18"/>
+                <w:szCs w:val="18"/>
+              </w:rPr>
+              <w:t>ik</w:t>
+            </w:r>
+            <w:proofErr w:type="spellEnd"/>
+            <w:r>
+              <w:rPr>
+                <w:sz w:val="18"/>
+                <w:szCs w:val="18"/>
+              </w:rPr>
+              <w:t xml:space="preserve"> wat er </w:t>
+            </w:r>
+            <w:proofErr w:type="spellStart"/>
+            <w:r>
+              <w:rPr>
+                <w:sz w:val="18"/>
+                <w:szCs w:val="18"/>
+              </w:rPr>
+              <w:t>gebeurt</w:t>
+            </w:r>
+            <w:proofErr w:type="spellEnd"/>
+            <w:r>
+              <w:rPr>
+                <w:sz w:val="18"/>
+                <w:szCs w:val="18"/>
+              </w:rPr>
+              <w:t xml:space="preserve"> </w:t>
+            </w:r>
+            <w:proofErr w:type="spellStart"/>
+            <w:r>
+              <w:rPr>
+                <w:sz w:val="18"/>
+                <w:szCs w:val="18"/>
+              </w:rPr>
+              <w:t>als</w:t>
+            </w:r>
+            <w:proofErr w:type="spellEnd"/>
+            <w:r>
+              <w:rPr>
+                <w:sz w:val="18"/>
+                <w:szCs w:val="18"/>
+              </w:rPr>
+              <w:t xml:space="preserve"> </w:t>
+            </w:r>
+            <w:proofErr w:type="spellStart"/>
+            <w:r>
+              <w:rPr>
+                <w:sz w:val="18"/>
+                <w:szCs w:val="18"/>
+              </w:rPr>
+              <w:t>ik</w:t>
+            </w:r>
+            <w:proofErr w:type="spellEnd"/>
+            <w:r>
+              <w:rPr>
+                <w:sz w:val="18"/>
+                <w:szCs w:val="18"/>
+              </w:rPr>
+              <w:t xml:space="preserve"> </w:t>
+            </w:r>
+            <w:proofErr w:type="spellStart"/>
+            <w:r>
+              <w:rPr>
+                <w:sz w:val="18"/>
+                <w:szCs w:val="18"/>
+              </w:rPr>
+              <w:t>klik</w:t>
+            </w:r>
+            <w:proofErr w:type="spellEnd"/>
+            <w:r>
+              <w:rPr>
+                <w:sz w:val="18"/>
+                <w:szCs w:val="18"/>
+              </w:rPr>
+              <w:t>?</w:t>
             </w:r>
           </w:p>
         </w:tc>
@@ -1757,8 +2078,39 @@
                 <w:sz w:val="18"/>
                 <w:szCs w:val="18"/>
               </w:rPr>
-              <w:t>3. De kritische vergelijker</w:t>
-            </w:r>
+              <w:t xml:space="preserve">3. De </w:t>
+            </w:r>
+            <w:proofErr w:type="spellStart"/>
+            <w:r>
+              <w:rPr>
+                <w:b/>
+                <w:bCs/>
+                <w:sz w:val="18"/>
+                <w:szCs w:val="18"/>
+              </w:rPr>
+              <w:t>kritische</w:t>
+            </w:r>
+            <w:proofErr w:type="spellEnd"/>
+            <w:r>
+              <w:rPr>
+                <w:b/>
+                <w:bCs/>
+                <w:sz w:val="18"/>
+                <w:szCs w:val="18"/>
+              </w:rPr>
+              <w:t xml:space="preserve"> </w:t>
+            </w:r>
+            <w:proofErr w:type="spellStart"/>
+            <w:r>
+              <w:rPr>
+                <w:b/>
+                <w:bCs/>
+                <w:sz w:val="18"/>
+                <w:szCs w:val="18"/>
+              </w:rPr>
+              <w:t>vergelijker</w:t>
+            </w:r>
+            <w:proofErr w:type="spellEnd"/>
           </w:p>
         </w:tc>
         <w:tc>
@@ -1896,8 +2248,39 @@
                 <w:sz w:val="18"/>
                 <w:szCs w:val="18"/>
               </w:rPr>
-              <w:t>. De taalarme gebruiker</w:t>
-            </w:r>
+              <w:t xml:space="preserve">. De </w:t>
+            </w:r>
+            <w:proofErr w:type="spellStart"/>
+            <w:r>
+              <w:rPr>
+                <w:b/>
+                <w:bCs/>
+                <w:sz w:val="18"/>
+                <w:szCs w:val="18"/>
+              </w:rPr>
+              <w:t>taalarme</w:t>
+            </w:r>
+            <w:proofErr w:type="spellEnd"/>
+            <w:r>
+              <w:rPr>
+                <w:b/>
+                <w:bCs/>
+                <w:sz w:val="18"/>
+                <w:szCs w:val="18"/>
+              </w:rPr>
+              <w:t xml:space="preserve"> </w:t>
+            </w:r>
+            <w:proofErr w:type="spellStart"/>
+            <w:r>
+              <w:rPr>
+                <w:b/>
+                <w:bCs/>
+                <w:sz w:val="18"/>
+                <w:szCs w:val="18"/>
+              </w:rPr>
+              <w:t>gebruiker</w:t>
+            </w:r>
+            <w:proofErr w:type="spellEnd"/>
           </w:p>
         </w:tc>
         <w:tc>
@@ -2038,12 +2421,101 @@
               </w:rPr>
               <w:t xml:space="preserve">Passen de knoppen op het scherm? Zijn ze groot genoeg om te raken? </w:t>
             </w:r>
-            <w:r>
-              <w:rPr>
-                <w:sz w:val="18"/>
-                <w:szCs w:val="18"/>
-              </w:rPr>
-              <w:t>Werkt alles nog als het langzaam laadt?</w:t>
+            <w:proofErr w:type="spellStart"/>
+            <w:r>
+              <w:rPr>
+                <w:sz w:val="18"/>
+                <w:szCs w:val="18"/>
+              </w:rPr>
+              <w:t>Werkt</w:t>
+            </w:r>
+            <w:proofErr w:type="spellEnd"/>
+            <w:r>
+              <w:rPr>
+                <w:sz w:val="18"/>
+                <w:szCs w:val="18"/>
+              </w:rPr>
+              <w:t xml:space="preserve"> </w:t>
+            </w:r>
+            <w:proofErr w:type="spellStart"/>
+            <w:r>
+              <w:rPr>
+                <w:sz w:val="18"/>
+                <w:szCs w:val="18"/>
+              </w:rPr>
+              <w:t>alles</w:t>
+            </w:r>
+            <w:proofErr w:type="spellEnd"/>
+            <w:r>
+              <w:rPr>
+                <w:sz w:val="18"/>
+                <w:szCs w:val="18"/>
+              </w:rPr>
+              <w:t xml:space="preserve"> </w:t>
+            </w:r>
+            <w:proofErr w:type="spellStart"/>
+            <w:r>
+              <w:rPr>
+                <w:sz w:val="18"/>
+                <w:szCs w:val="18"/>
+              </w:rPr>
+              <w:t>nog</w:t>
+            </w:r>
+            <w:proofErr w:type="spellEnd"/>
+            <w:r>
+              <w:rPr>
+                <w:sz w:val="18"/>
+                <w:szCs w:val="18"/>
+              </w:rPr>
+              <w:t xml:space="preserve"> </w:t>
+            </w:r>
+            <w:proofErr w:type="spellStart"/>
+            <w:r>
+              <w:rPr>
+                <w:sz w:val="18"/>
+                <w:szCs w:val="18"/>
+              </w:rPr>
+              <w:t>als</w:t>
+            </w:r>
+            <w:proofErr w:type="spellEnd"/>
+            <w:r>
+              <w:rPr>
+                <w:sz w:val="18"/>
+                <w:szCs w:val="18"/>
+              </w:rPr>
+              <w:t xml:space="preserve"> het </w:t>
+            </w:r>
+            <w:proofErr w:type="spellStart"/>
+            <w:r>
+              <w:rPr>
+                <w:sz w:val="18"/>
+                <w:szCs w:val="18"/>
+              </w:rPr>
+              <w:t>langzaam</w:t>
+            </w:r>
+            <w:proofErr w:type="spellEnd"/>
+            <w:r>
+              <w:rPr>
+                <w:sz w:val="18"/>
+                <w:szCs w:val="18"/>
+              </w:rPr>
+              <w:t xml:space="preserve"> </w:t>
+            </w:r>
+            <w:proofErr w:type="spellStart"/>
+            <w:r>
+              <w:rPr>
+                <w:sz w:val="18"/>
+                <w:szCs w:val="18"/>
+              </w:rPr>
+              <w:t>laadt</w:t>
+            </w:r>
+            <w:proofErr w:type="spellEnd"/>
+            <w:r>
+              <w:rPr>
+                <w:sz w:val="18"/>
+                <w:szCs w:val="18"/>
+              </w:rPr>
+              <w:t>?</w:t>
             </w:r>
           </w:p>
         </w:tc>
@@ -2078,6 +2550,79 @@
     <w:p>
       <w:pPr>
         <w:spacing w:after="140"/>
+        <w:rPr>
+          <w:b/>
+          <w:bCs/>
+          <w:lang w:val="nl-NL"/>
+        </w:rPr>
+      </w:pPr>
+      <w:r>
+        <w:rPr>
+          <w:b/>
+          <w:bCs/>
+          <w:lang w:val="nl-NL"/>
+        </w:rPr>
+        <w:t>Evaluatie vanuit personage 1: De haastige gebruiker</w:t>
+      </w:r>
+    </w:p>
+    <w:p>
+      <w:pPr>
+        <w:spacing w:after="140"/>
+        <w:rPr>
+          <w:lang w:val="nl-NL"/>
+        </w:rPr>
+      </w:pPr>
+      <w:r>
+        <w:rPr>
+          <w:lang w:val="nl-NL"/>
+        </w:rPr>
+        <w:t>Als haastige gebruiker wil ik binnen een minuut klaar zijn en lees ik bijna geen tekst. Ik heb de website daarom beoordeeld op hoe snel ik kan vinden wat ik zoek.</w:t>
+      </w:r>
+    </w:p>
+    <w:p>
+      <w:pPr>
+        <w:spacing w:after="140"/>
+        <w:rPr>
+          <w:lang w:val="nl-NL"/>
+        </w:rPr>
+      </w:pPr>
+      <w:r>
+        <w:rPr>
+          <w:lang w:val="nl-NL"/>
+        </w:rPr>
+        <w:t>Het menu en de drankenkaart staan alleen klein rechtsboven op de pagina. Als je snel kijkt, mis je ze gemakkelijk. Daarnaast werkt de knop om een tafel te boeken niet: je krijgt een foutmelding. Een haastige gebruiker probeert het dan niet opnieuw, maar gaat weg. Bij de drankenkaart scrolt de pagina na het klikken op "</w:t>
+      </w:r>
+      <w:proofErr w:type="gramStart"/>
+      <w:r>
+        <w:rPr>
+          <w:lang w:val="nl-NL"/>
+        </w:rPr>
+        <w:t>Soft drinks</w:t>
+      </w:r>
+      <w:proofErr w:type="gramEnd"/>
+      <w:r>
+        <w:rPr>
+          <w:lang w:val="nl-NL"/>
+        </w:rPr>
+        <w:t>" automatisch naar beneden, maar te ver, waardoor je zelf terug moet scrollen. Ook staan de pasta's alleen met Italiaanse namen, zonder uitleg over wat erin zit. Daardoor kun je niet snel kiezen.</w:t>
+      </w:r>
+    </w:p>
+    <w:p>
+      <w:pPr>
+        <w:spacing w:after="140"/>
+        <w:rPr>
+          <w:b/>
+          <w:bCs/>
+          <w:lang w:val="nl-NL"/>
+        </w:rPr>
+      </w:pPr>
+    </w:p>
+    <w:p>
+      <w:pPr>
+        <w:spacing w:after="140"/>
+        <w:rPr>
+          <w:lang w:val="nl-NL"/>
+        </w:rPr>
       </w:pPr>
     </w:p>
     <w:p>
@@ -2105,7 +2650,10 @@
     </w:p>
     <w:p>
       <w:pPr>
-        <w:pStyle w:val="Heading2"/>
+        <w:pStyle w:val="Kop2"/>
+        <w:rPr>
+          <w:lang w:val="nl-NL"/>
+        </w:rPr>
       </w:pPr>
       <w:r>
         <w:rPr>
@@ -2159,13 +2707,34 @@
         </w:rPr>
         <w:t xml:space="preserve">tijdens het uitvoeren. Loop je vast, schrijf dan op waar en waarom. </w:t>
       </w:r>
-      <w:r>
-        <w:t>Vastlopen is waardevolle informatie.</w:t>
+      <w:proofErr w:type="spellStart"/>
+      <w:r>
+        <w:t>Vastlopen</w:t>
+      </w:r>
+      <w:proofErr w:type="spellEnd"/>
+      <w:r>
+        <w:t xml:space="preserve"> is </w:t>
+      </w:r>
+      <w:proofErr w:type="spellStart"/>
+      <w:r>
+        <w:t>waardevolle</w:t>
+      </w:r>
+      <w:proofErr w:type="spellEnd"/>
+      <w:r>
+        <w:t xml:space="preserve"> </w:t>
+      </w:r>
+      <w:proofErr w:type="spellStart"/>
+      <w:r>
+        <w:t>informatie</w:t>
+      </w:r>
+      <w:proofErr w:type="spellEnd"/>
+      <w:r>
+        <w:t>.</w:t>
       </w:r>
     </w:p>
     <w:tbl>
       <w:tblPr>
-        <w:tblStyle w:val="GridTable1Light"/>
+        <w:tblStyle w:val="Rastertabel1licht"/>
         <w:tblW w:w="9360" w:type="dxa"/>
         <w:tblLook w:val="0000" w:firstRow="0" w:lastRow="0" w:firstColumn="0" w:lastColumn="0" w:noHBand="0" w:noVBand="0"/>
       </w:tblPr>
@@ -2216,21 +2785,9 @@
                 <w:sz w:val="18"/>
                 <w:szCs w:val="18"/>
               </w:rPr>
-              <w:t>Taak die je uitvoerde</w:t>
-            </w:r>
-          </w:p>
-        </w:tc>
-        <w:tc>
-          <w:tcPr>
-            <w:tcW w:w="1500" w:type="dxa"/>
-          </w:tcPr>
-          <w:p>
-            <w:pPr>
-              <w:rPr>
-                <w:color w:val="000000" w:themeColor="text1"/>
-                <w:lang w:val="nl-NL"/>
-              </w:rPr>
-            </w:pPr>
+              <w:t xml:space="preserve">Taak die je </w:t>
+            </w:r>
+            <w:proofErr w:type="spellStart"/>
             <w:r>
               <w:rPr>
                 <w:b/>
@@ -2238,15 +2795,15 @@
                 <w:color w:val="000000" w:themeColor="text1"/>
                 <w:sz w:val="18"/>
                 <w:szCs w:val="18"/>
-                <w:lang w:val="nl-NL"/>
-              </w:rPr>
-              <w:t>Gelukt? (ja / nee / met moeite)</w:t>
-            </w:r>
-          </w:p>
-        </w:tc>
-        <w:tc>
-          <w:tcPr>
-            <w:tcW w:w="3760" w:type="dxa"/>
+              </w:rPr>
+              <w:t>uitvoerde</w:t>
+            </w:r>
+            <w:proofErr w:type="spellEnd"/>
+          </w:p>
+        </w:tc>
+        <w:tc>
+          <w:tcPr>
+            <w:tcW w:w="1500" w:type="dxa"/>
           </w:tcPr>
           <w:p>
             <w:pPr>
@@ -2264,6 +2821,78 @@
                 <w:szCs w:val="18"/>
                 <w:lang w:val="nl-NL"/>
               </w:rPr>
+              <w:t>Gelukt? (</w:t>
+            </w:r>
+            <w:proofErr w:type="gramStart"/>
+            <w:r>
+              <w:rPr>
+                <w:b/>
+                <w:bCs/>
+                <w:color w:val="000000" w:themeColor="text1"/>
+                <w:sz w:val="18"/>
+                <w:szCs w:val="18"/>
+                <w:lang w:val="nl-NL"/>
+              </w:rPr>
+              <w:t>ja /</w:t>
+            </w:r>
+            <w:proofErr w:type="gramEnd"/>
+            <w:r>
+              <w:rPr>
+                <w:b/>
+                <w:bCs/>
+                <w:color w:val="000000" w:themeColor="text1"/>
+                <w:sz w:val="18"/>
+                <w:szCs w:val="18"/>
+                <w:lang w:val="nl-NL"/>
+              </w:rPr>
+              <w:t xml:space="preserve"> </w:t>
+            </w:r>
+            <w:proofErr w:type="gramStart"/>
+            <w:r>
+              <w:rPr>
+                <w:b/>
+                <w:bCs/>
+                <w:color w:val="000000" w:themeColor="text1"/>
+                <w:sz w:val="18"/>
+                <w:szCs w:val="18"/>
+                <w:lang w:val="nl-NL"/>
+              </w:rPr>
+              <w:t>nee /</w:t>
+            </w:r>
+            <w:proofErr w:type="gramEnd"/>
+            <w:r>
+              <w:rPr>
+                <w:b/>
+                <w:bCs/>
+                <w:color w:val="000000" w:themeColor="text1"/>
+                <w:sz w:val="18"/>
+                <w:szCs w:val="18"/>
+                <w:lang w:val="nl-NL"/>
+              </w:rPr>
+              <w:t xml:space="preserve"> met moeite)</w:t>
+            </w:r>
+          </w:p>
+        </w:tc>
+        <w:tc>
+          <w:tcPr>
+            <w:tcW w:w="3760" w:type="dxa"/>
+          </w:tcPr>
+          <w:p>
+            <w:pPr>
+              <w:rPr>
+                <w:color w:val="000000" w:themeColor="text1"/>
+                <w:lang w:val="nl-NL"/>
+              </w:rPr>
+            </w:pPr>
+            <w:r>
+              <w:rPr>
+                <w:b/>
+                <w:bCs/>
+                <w:color w:val="000000" w:themeColor="text1"/>
+                <w:sz w:val="18"/>
+                <w:szCs w:val="18"/>
+                <w:lang w:val="nl-NL"/>
+              </w:rPr>
               <w:t>Wat viel je op als dit personage?</w:t>
             </w:r>
           </w:p>
@@ -2296,16 +2925,37 @@
           <w:p>
             <w:pPr>
               <w:spacing w:after="30"/>
-            </w:pPr>
-          </w:p>
-          <w:p>
-            <w:pPr>
-              <w:spacing w:after="30"/>
-            </w:pPr>
-          </w:p>
-          <w:p>
-            <w:pPr>
-              <w:spacing w:after="30"/>
+              <w:rPr>
+                <w:lang w:val="nl-NL"/>
+              </w:rPr>
+            </w:pPr>
+            <w:r>
+              <w:rPr>
+                <w:lang w:val="nl-NL"/>
+              </w:rPr>
+              <w:t xml:space="preserve">Ik wil een tafel </w:t>
+            </w:r>
+            <w:r>
+              <w:rPr>
+                <w:lang w:val="nl-NL"/>
+              </w:rPr>
+              <w:t>boeken</w:t>
+            </w:r>
+          </w:p>
+          <w:p>
+            <w:pPr>
+              <w:spacing w:after="30"/>
+              <w:rPr>
+                <w:lang w:val="nl-NL"/>
+              </w:rPr>
+            </w:pPr>
+          </w:p>
+          <w:p>
+            <w:pPr>
+              <w:spacing w:after="30"/>
+              <w:rPr>
+                <w:lang w:val="nl-NL"/>
+              </w:rPr>
             </w:pPr>
           </w:p>
         </w:tc>
@@ -2316,16 +2966,25 @@
           <w:p>
             <w:pPr>
               <w:spacing w:after="30"/>
-            </w:pPr>
-          </w:p>
-          <w:p>
-            <w:pPr>
-              <w:spacing w:after="30"/>
-            </w:pPr>
-          </w:p>
-          <w:p>
-            <w:pPr>
-              <w:spacing w:after="30"/>
+              <w:rPr>
+                <w:lang w:val="nl-NL"/>
+              </w:rPr>
+            </w:pPr>
+            <w:proofErr w:type="gramStart"/>
+            <w:r>
+              <w:rPr>
+                <w:lang w:val="nl-NL"/>
+              </w:rPr>
+              <w:t>nee</w:t>
+            </w:r>
+            <w:proofErr w:type="gramEnd"/>
+          </w:p>
+          <w:p>
+            <w:pPr>
+              <w:spacing w:after="30"/>
+              <w:rPr>
+                <w:lang w:val="nl-NL"/>
+              </w:rPr>
             </w:pPr>
           </w:p>
         </w:tc>
@@ -2336,16 +2995,31 @@
           <w:p>
             <w:pPr>
               <w:spacing w:after="30"/>
-            </w:pPr>
-          </w:p>
-          <w:p>
-            <w:pPr>
-              <w:spacing w:after="30"/>
-            </w:pPr>
-          </w:p>
-          <w:p>
-            <w:pPr>
-              <w:spacing w:after="30"/>
+              <w:rPr>
+                <w:lang w:val="nl-NL"/>
+              </w:rPr>
+            </w:pPr>
+            <w:r>
+              <w:rPr>
+                <w:lang w:val="nl-NL"/>
+              </w:rPr>
+              <w:t>Ik wilde snel door en een tafel boeken maar dat lukte niet</w:t>
+            </w:r>
+          </w:p>
+          <w:p>
+            <w:pPr>
+              <w:spacing w:after="30"/>
+              <w:rPr>
+                <w:lang w:val="nl-NL"/>
+              </w:rPr>
+            </w:pPr>
+          </w:p>
+          <w:p>
+            <w:pPr>
+              <w:spacing w:after="30"/>
+              <w:rPr>
+                <w:lang w:val="nl-NL"/>
+              </w:rPr>
             </w:pPr>
           </w:p>
         </w:tc>
@@ -2377,16 +3051,29 @@
           <w:p>
             <w:pPr>
               <w:spacing w:after="30"/>
-            </w:pPr>
-          </w:p>
-          <w:p>
-            <w:pPr>
-              <w:spacing w:after="30"/>
-            </w:pPr>
-          </w:p>
-          <w:p>
-            <w:pPr>
-              <w:spacing w:after="30"/>
+              <w:rPr>
+                <w:lang w:val="nl-NL"/>
+              </w:rPr>
+            </w:pPr>
+            <w:r>
+              <w:rPr>
+                <w:lang w:val="nl-NL"/>
+              </w:rPr>
+              <w:t>Ik wil het menu z</w:t>
+            </w:r>
+            <w:r>
+              <w:rPr>
+                <w:lang w:val="nl-NL"/>
+              </w:rPr>
+              <w:t>ien</w:t>
+            </w:r>
+          </w:p>
+          <w:p>
+            <w:pPr>
+              <w:spacing w:after="30"/>
+              <w:rPr>
+                <w:lang w:val="nl-NL"/>
+              </w:rPr>
             </w:pPr>
           </w:p>
         </w:tc>
@@ -2397,16 +3084,23 @@
           <w:p>
             <w:pPr>
               <w:spacing w:after="30"/>
-            </w:pPr>
-          </w:p>
-          <w:p>
-            <w:pPr>
-              <w:spacing w:after="30"/>
-            </w:pPr>
-          </w:p>
-          <w:p>
-            <w:pPr>
-              <w:spacing w:after="30"/>
+              <w:rPr>
+                <w:lang w:val="nl-NL"/>
+              </w:rPr>
+            </w:pPr>
+            <w:r>
+              <w:rPr>
+                <w:lang w:val="nl-NL"/>
+              </w:rPr>
+              <w:t xml:space="preserve">Ja </w:t>
+            </w:r>
+          </w:p>
+          <w:p>
+            <w:pPr>
+              <w:spacing w:after="30"/>
+              <w:rPr>
+                <w:lang w:val="nl-NL"/>
+              </w:rPr>
             </w:pPr>
           </w:p>
         </w:tc>
@@ -2417,16 +3111,37 @@
           <w:p>
             <w:pPr>
               <w:spacing w:after="30"/>
-            </w:pPr>
-          </w:p>
-          <w:p>
-            <w:pPr>
-              <w:spacing w:after="30"/>
-            </w:pPr>
-          </w:p>
-          <w:p>
-            <w:pPr>
-              <w:spacing w:after="30"/>
+              <w:rPr>
+                <w:lang w:val="nl-NL"/>
+              </w:rPr>
+            </w:pPr>
+            <w:r>
+              <w:rPr>
+                <w:lang w:val="nl-NL"/>
+              </w:rPr>
+              <w:t xml:space="preserve">De eerste keer kon ik niet </w:t>
+            </w:r>
+            <w:proofErr w:type="gramStart"/>
+            <w:r>
+              <w:rPr>
+                <w:lang w:val="nl-NL"/>
+              </w:rPr>
+              <w:t>vinden  waar</w:t>
+            </w:r>
+            <w:proofErr w:type="gramEnd"/>
+            <w:r>
+              <w:rPr>
+                <w:lang w:val="nl-NL"/>
+              </w:rPr>
+              <w:t xml:space="preserve"> het stond dus toen moet ik weer omhoog scrollen om het te vinden en als mijn personage was het te langzaam gevonden </w:t>
+            </w:r>
+          </w:p>
+          <w:p>
+            <w:pPr>
+              <w:spacing w:after="30"/>
+              <w:rPr>
+                <w:lang w:val="nl-NL"/>
+              </w:rPr>
             </w:pPr>
           </w:p>
         </w:tc>
@@ -2458,17 +3173,22 @@
           <w:p>
             <w:pPr>
               <w:spacing w:after="30"/>
-            </w:pPr>
-          </w:p>
-          <w:p>
-            <w:pPr>
-              <w:spacing w:after="30"/>
-            </w:pPr>
-          </w:p>
-          <w:p>
-            <w:pPr>
-              <w:spacing w:after="30"/>
-            </w:pPr>
+              <w:rPr>
+                <w:lang w:val="nl-NL"/>
+              </w:rPr>
+            </w:pPr>
+            <w:r>
+              <w:rPr>
+                <w:lang w:val="nl-NL"/>
+              </w:rPr>
+              <w:t>Binnen het menu het d</w:t>
+            </w:r>
+            <w:r>
+              <w:rPr>
+                <w:lang w:val="nl-NL"/>
+              </w:rPr>
+              <w:t>rinken vinden</w:t>
+            </w:r>
           </w:p>
         </w:tc>
         <w:tc>
@@ -2478,16 +3198,23 @@
           <w:p>
             <w:pPr>
               <w:spacing w:after="30"/>
-            </w:pPr>
-          </w:p>
-          <w:p>
-            <w:pPr>
-              <w:spacing w:after="30"/>
-            </w:pPr>
-          </w:p>
-          <w:p>
-            <w:pPr>
-              <w:spacing w:after="30"/>
+              <w:rPr>
+                <w:lang w:val="nl-NL"/>
+              </w:rPr>
+            </w:pPr>
+            <w:r>
+              <w:rPr>
+                <w:lang w:val="nl-NL"/>
+              </w:rPr>
+              <w:t xml:space="preserve">Ja </w:t>
+            </w:r>
+          </w:p>
+          <w:p>
+            <w:pPr>
+              <w:spacing w:after="30"/>
+              <w:rPr>
+                <w:lang w:val="nl-NL"/>
+              </w:rPr>
             </w:pPr>
           </w:p>
         </w:tc>
@@ -2498,16 +3225,65 @@
           <w:p>
             <w:pPr>
               <w:spacing w:after="30"/>
-            </w:pPr>
-          </w:p>
-          <w:p>
-            <w:pPr>
-              <w:spacing w:after="30"/>
-            </w:pPr>
-          </w:p>
-          <w:p>
-            <w:pPr>
-              <w:spacing w:after="30"/>
+              <w:rPr>
+                <w:lang w:val="nl-NL"/>
+              </w:rPr>
+            </w:pPr>
+            <w:r>
+              <w:rPr>
+                <w:lang w:val="nl-NL"/>
+              </w:rPr>
+              <w:t xml:space="preserve">Het was goed te vinden en te lezen als je normaal scrolde maar het was </w:t>
+            </w:r>
+            <w:proofErr w:type="spellStart"/>
+            <w:r>
+              <w:rPr>
+                <w:lang w:val="nl-NL"/>
+              </w:rPr>
+              <w:t>onhadig</w:t>
+            </w:r>
+            <w:proofErr w:type="spellEnd"/>
+            <w:r>
+              <w:rPr>
+                <w:lang w:val="nl-NL"/>
+              </w:rPr>
+              <w:t xml:space="preserve"> dat als ik op </w:t>
+            </w:r>
+            <w:proofErr w:type="spellStart"/>
+            <w:r>
+              <w:rPr>
+                <w:lang w:val="nl-NL"/>
+              </w:rPr>
+              <w:t>bijv</w:t>
+            </w:r>
+            <w:proofErr w:type="spellEnd"/>
+            <w:r>
+              <w:rPr>
+                <w:lang w:val="nl-NL"/>
+              </w:rPr>
+              <w:t xml:space="preserve"> </w:t>
+            </w:r>
+            <w:proofErr w:type="gramStart"/>
+            <w:r>
+              <w:rPr>
+                <w:lang w:val="nl-NL"/>
+              </w:rPr>
+              <w:t>fris dranken</w:t>
+            </w:r>
+            <w:proofErr w:type="gramEnd"/>
+            <w:r>
+              <w:rPr>
+                <w:lang w:val="nl-NL"/>
+              </w:rPr>
+              <w:t xml:space="preserve"> drukte hij te ver naar beneden scrolde en daardoor zag ik maar de helft van wat er te bieden was</w:t>
+            </w:r>
+          </w:p>
+          <w:p>
+            <w:pPr>
+              <w:spacing w:after="30"/>
+              <w:rPr>
+                <w:lang w:val="nl-NL"/>
+              </w:rPr>
             </w:pPr>
           </w:p>
         </w:tc>
@@ -2516,6 +3292,9 @@
     <w:p>
       <w:pPr>
         <w:spacing w:after="140"/>
+        <w:rPr>
+          <w:lang w:val="nl-NL"/>
+        </w:rPr>
       </w:pPr>
     </w:p>
     <w:p>
@@ -2543,7 +3322,7 @@
     </w:p>
     <w:p>
       <w:pPr>
-        <w:pStyle w:val="Heading2"/>
+        <w:pStyle w:val="Kop2"/>
         <w:rPr>
           <w:lang w:val="nl-NL"/>
         </w:rPr>
@@ -2558,7 +3337,7 @@
     </w:p>
     <w:p>
       <w:pPr>
-        <w:pStyle w:val="Heading3"/>
+        <w:pStyle w:val="Kop3"/>
         <w:rPr>
           <w:lang w:val="nl-NL"/>
         </w:rPr>
@@ -2580,7 +3359,7 @@
     </w:p>
     <w:tbl>
       <w:tblPr>
-        <w:tblStyle w:val="GridTable1Light"/>
+        <w:tblStyle w:val="Rastertabel1licht"/>
         <w:tblW w:w="9360" w:type="dxa"/>
         <w:tblLook w:val="0000" w:firstRow="0" w:lastRow="0" w:firstColumn="0" w:lastColumn="0" w:noHBand="0" w:noVBand="0"/>
       </w:tblPr>
@@ -2623,6 +3402,7 @@
                 <w:color w:val="000000" w:themeColor="text1"/>
               </w:rPr>
             </w:pPr>
+            <w:proofErr w:type="spellStart"/>
             <w:r>
               <w:rPr>
                 <w:b/>
@@ -2631,8 +3411,53 @@
                 <w:sz w:val="18"/>
                 <w:szCs w:val="18"/>
               </w:rPr>
-              <w:t>Concreet en bruikbaar</w:t>
-            </w:r>
+              <w:t>Concreet</w:t>
+            </w:r>
+            <w:proofErr w:type="spellEnd"/>
+            <w:r>
+              <w:rPr>
+                <w:b/>
+                <w:bCs/>
+                <w:color w:val="000000" w:themeColor="text1"/>
+                <w:sz w:val="18"/>
+                <w:szCs w:val="18"/>
+              </w:rPr>
+              <w:t xml:space="preserve"> </w:t>
+            </w:r>
+            <w:proofErr w:type="spellStart"/>
+            <w:r>
+              <w:rPr>
+                <w:b/>
+                <w:bCs/>
+                <w:color w:val="000000" w:themeColor="text1"/>
+                <w:sz w:val="18"/>
+                <w:szCs w:val="18"/>
+              </w:rPr>
+              <w:t>en</w:t>
+            </w:r>
+            <w:proofErr w:type="spellEnd"/>
+            <w:r>
+              <w:rPr>
+                <w:b/>
+                <w:bCs/>
+                <w:color w:val="000000" w:themeColor="text1"/>
+                <w:sz w:val="18"/>
+                <w:szCs w:val="18"/>
+              </w:rPr>
+              <w:t xml:space="preserve"> </w:t>
+            </w:r>
+            <w:proofErr w:type="spellStart"/>
+            <w:r>
+              <w:rPr>
+                <w:b/>
+                <w:bCs/>
+                <w:color w:val="000000" w:themeColor="text1"/>
+                <w:sz w:val="18"/>
+                <w:szCs w:val="18"/>
+              </w:rPr>
+              <w:t>bruikbaar</w:t>
+            </w:r>
+            <w:proofErr w:type="spellEnd"/>
           </w:p>
         </w:tc>
       </w:tr>
@@ -2650,7 +3475,39 @@
                 <w:sz w:val="18"/>
                 <w:szCs w:val="18"/>
               </w:rPr>
-              <w:t>De navigatie is onduidelijk.</w:t>
+              <w:t xml:space="preserve">De </w:t>
+            </w:r>
+            <w:proofErr w:type="spellStart"/>
+            <w:r>
+              <w:rPr>
+                <w:sz w:val="18"/>
+                <w:szCs w:val="18"/>
+              </w:rPr>
+              <w:t>navigatie</w:t>
+            </w:r>
+            <w:proofErr w:type="spellEnd"/>
+            <w:r>
+              <w:rPr>
+                <w:sz w:val="18"/>
+                <w:szCs w:val="18"/>
+              </w:rPr>
+              <w:t xml:space="preserve"> is </w:t>
+            </w:r>
+            <w:proofErr w:type="spellStart"/>
+            <w:r>
+              <w:rPr>
+                <w:sz w:val="18"/>
+                <w:szCs w:val="18"/>
+              </w:rPr>
+              <w:t>onduidelijk</w:t>
+            </w:r>
+            <w:proofErr w:type="spellEnd"/>
+            <w:r>
+              <w:rPr>
+                <w:sz w:val="18"/>
+                <w:szCs w:val="18"/>
+              </w:rPr>
+              <w:t>.</w:t>
             </w:r>
           </w:p>
         </w:tc>
@@ -2675,7 +3532,55 @@
                 <w:sz w:val="18"/>
                 <w:szCs w:val="18"/>
               </w:rPr>
-              <w:t>Zet de knop bovenaan of maak hem zwevend.</w:t>
+              <w:t xml:space="preserve">Zet de knop </w:t>
+            </w:r>
+            <w:proofErr w:type="spellStart"/>
+            <w:r>
+              <w:rPr>
+                <w:sz w:val="18"/>
+                <w:szCs w:val="18"/>
+              </w:rPr>
+              <w:t>bovenaan</w:t>
+            </w:r>
+            <w:proofErr w:type="spellEnd"/>
+            <w:r>
+              <w:rPr>
+                <w:sz w:val="18"/>
+                <w:szCs w:val="18"/>
+              </w:rPr>
+              <w:t xml:space="preserve"> of </w:t>
+            </w:r>
+            <w:proofErr w:type="spellStart"/>
+            <w:r>
+              <w:rPr>
+                <w:sz w:val="18"/>
+                <w:szCs w:val="18"/>
+              </w:rPr>
+              <w:t>maak</w:t>
+            </w:r>
+            <w:proofErr w:type="spellEnd"/>
+            <w:r>
+              <w:rPr>
+                <w:sz w:val="18"/>
+                <w:szCs w:val="18"/>
+              </w:rPr>
+              <w:t xml:space="preserve"> hem </w:t>
+            </w:r>
+            <w:proofErr w:type="spellStart"/>
+            <w:r>
+              <w:rPr>
+                <w:sz w:val="18"/>
+                <w:szCs w:val="18"/>
+              </w:rPr>
+              <w:t>zwevend</w:t>
+            </w:r>
+            <w:proofErr w:type="spellEnd"/>
+            <w:r>
+              <w:rPr>
+                <w:sz w:val="18"/>
+                <w:szCs w:val="18"/>
+              </w:rPr>
+              <w:t>.</w:t>
             </w:r>
           </w:p>
         </w:tc>
@@ -2723,7 +3628,55 @@
                 <w:sz w:val="18"/>
                 <w:szCs w:val="18"/>
               </w:rPr>
-              <w:t>Maak de tekst donkerder of groter.</w:t>
+              <w:t xml:space="preserve">Maak de </w:t>
+            </w:r>
+            <w:proofErr w:type="spellStart"/>
+            <w:r>
+              <w:rPr>
+                <w:sz w:val="18"/>
+                <w:szCs w:val="18"/>
+              </w:rPr>
+              <w:t>tekst</w:t>
+            </w:r>
+            <w:proofErr w:type="spellEnd"/>
+            <w:r>
+              <w:rPr>
+                <w:sz w:val="18"/>
+                <w:szCs w:val="18"/>
+              </w:rPr>
+              <w:t xml:space="preserve"> </w:t>
+            </w:r>
+            <w:proofErr w:type="spellStart"/>
+            <w:r>
+              <w:rPr>
+                <w:sz w:val="18"/>
+                <w:szCs w:val="18"/>
+              </w:rPr>
+              <w:t>donkerder</w:t>
+            </w:r>
+            <w:proofErr w:type="spellEnd"/>
+            <w:r>
+              <w:rPr>
+                <w:sz w:val="18"/>
+                <w:szCs w:val="18"/>
+              </w:rPr>
+              <w:t xml:space="preserve"> of </w:t>
+            </w:r>
+            <w:proofErr w:type="spellStart"/>
+            <w:r>
+              <w:rPr>
+                <w:sz w:val="18"/>
+                <w:szCs w:val="18"/>
+              </w:rPr>
+              <w:t>groter</w:t>
+            </w:r>
+            <w:proofErr w:type="spellEnd"/>
+            <w:r>
+              <w:rPr>
+                <w:sz w:val="18"/>
+                <w:szCs w:val="18"/>
+              </w:rPr>
+              <w:t>.</w:t>
             </w:r>
           </w:p>
         </w:tc>
@@ -2736,7 +3689,7 @@
     </w:p>
     <w:tbl>
       <w:tblPr>
-        <w:tblStyle w:val="GridTable1Light"/>
+        <w:tblStyle w:val="Rastertabel1licht"/>
         <w:tblW w:w="9360" w:type="dxa"/>
         <w:tblLook w:val="0000" w:firstRow="0" w:lastRow="0" w:firstColumn="0" w:lastColumn="0" w:noHBand="0" w:noVBand="0"/>
       </w:tblPr>
@@ -2852,6 +3805,7 @@
                 <w:color w:val="000000" w:themeColor="text1"/>
               </w:rPr>
             </w:pPr>
+            <w:proofErr w:type="spellStart"/>
             <w:r>
               <w:rPr>
                 <w:b/>
@@ -2860,7 +3814,40 @@
                 <w:sz w:val="18"/>
                 <w:szCs w:val="18"/>
               </w:rPr>
-              <w:t>Prioriteit (1 = hoog)</w:t>
+              <w:t>Prioriteit</w:t>
+            </w:r>
+            <w:proofErr w:type="spellEnd"/>
+            <w:r>
+              <w:rPr>
+                <w:b/>
+                <w:bCs/>
+                <w:color w:val="000000" w:themeColor="text1"/>
+                <w:sz w:val="18"/>
+                <w:szCs w:val="18"/>
+              </w:rPr>
+              <w:t xml:space="preserve"> (1 = </w:t>
+            </w:r>
+            <w:proofErr w:type="spellStart"/>
+            <w:r>
+              <w:rPr>
+                <w:b/>
+                <w:bCs/>
+                <w:color w:val="000000" w:themeColor="text1"/>
+                <w:sz w:val="18"/>
+                <w:szCs w:val="18"/>
+              </w:rPr>
+              <w:t>hoog</w:t>
+            </w:r>
+            <w:proofErr w:type="spellEnd"/>
+            <w:r>
+              <w:rPr>
+                <w:b/>
+                <w:bCs/>
+                <w:color w:val="000000" w:themeColor="text1"/>
+                <w:sz w:val="18"/>
+                <w:szCs w:val="18"/>
+              </w:rPr>
+              <w:t>)</w:t>
             </w:r>
           </w:p>
         </w:tc>
@@ -2892,22 +3879,24 @@
           <w:p>
             <w:pPr>
               <w:spacing w:after="30"/>
-            </w:pPr>
-          </w:p>
-          <w:p>
-            <w:pPr>
-              <w:spacing w:after="30"/>
-            </w:pPr>
-          </w:p>
-          <w:p>
-            <w:pPr>
-              <w:spacing w:after="30"/>
-            </w:pPr>
-          </w:p>
-          <w:p>
-            <w:pPr>
-              <w:spacing w:after="30"/>
-            </w:pPr>
+              <w:rPr>
+                <w:lang w:val="nl-NL"/>
+              </w:rPr>
+            </w:pPr>
+            <w:proofErr w:type="gramStart"/>
+            <w:r>
+              <w:rPr>
+                <w:lang w:val="nl-NL"/>
+              </w:rPr>
+              <w:t>zet</w:t>
+            </w:r>
+            <w:proofErr w:type="gramEnd"/>
+            <w:r>
+              <w:rPr>
+                <w:lang w:val="nl-NL"/>
+              </w:rPr>
+              <w:t xml:space="preserve"> het menu en de drankenkaart groter op de voorpagina, </w:t>
+            </w:r>
           </w:p>
         </w:tc>
         <w:tc>
@@ -2917,21 +3906,53 @@
           <w:p>
             <w:pPr>
               <w:spacing w:after="30"/>
-            </w:pPr>
-          </w:p>
-          <w:p>
-            <w:pPr>
-              <w:spacing w:after="30"/>
-            </w:pPr>
-          </w:p>
-          <w:p>
-            <w:pPr>
-              <w:spacing w:after="30"/>
-            </w:pPr>
-          </w:p>
-          <w:p>
-            <w:pPr>
-              <w:spacing w:after="30"/>
+              <w:rPr>
+                <w:lang w:val="nl-NL"/>
+              </w:rPr>
+            </w:pPr>
+            <w:r>
+              <w:rPr>
+                <w:lang w:val="nl-NL"/>
+              </w:rPr>
+              <w:t xml:space="preserve">Ik </w:t>
+            </w:r>
+            <w:proofErr w:type="spellStart"/>
+            <w:r>
+              <w:rPr>
+                <w:lang w:val="nl-NL"/>
+              </w:rPr>
+              <w:t>scroll</w:t>
+            </w:r>
+            <w:proofErr w:type="spellEnd"/>
+            <w:r>
+              <w:rPr>
+                <w:lang w:val="nl-NL"/>
+              </w:rPr>
+              <w:t xml:space="preserve"> te snel langs de menu kaart </w:t>
+            </w:r>
+          </w:p>
+          <w:p>
+            <w:pPr>
+              <w:spacing w:after="30"/>
+              <w:rPr>
+                <w:lang w:val="nl-NL"/>
+              </w:rPr>
+            </w:pPr>
+          </w:p>
+          <w:p>
+            <w:pPr>
+              <w:spacing w:after="30"/>
+              <w:rPr>
+                <w:lang w:val="nl-NL"/>
+              </w:rPr>
+            </w:pPr>
+          </w:p>
+          <w:p>
+            <w:pPr>
+              <w:spacing w:after="30"/>
+              <w:rPr>
+                <w:lang w:val="nl-NL"/>
+              </w:rPr>
             </w:pPr>
           </w:p>
         </w:tc>
@@ -2942,21 +3963,39 @@
           <w:p>
             <w:pPr>
               <w:spacing w:after="30"/>
-            </w:pPr>
-          </w:p>
-          <w:p>
-            <w:pPr>
-              <w:spacing w:after="30"/>
-            </w:pPr>
-          </w:p>
-          <w:p>
-            <w:pPr>
-              <w:spacing w:after="30"/>
-            </w:pPr>
-          </w:p>
-          <w:p>
-            <w:pPr>
-              <w:spacing w:after="30"/>
+              <w:rPr>
+                <w:lang w:val="nl-NL"/>
+              </w:rPr>
+            </w:pPr>
+            <w:r>
+              <w:rPr>
+                <w:lang w:val="nl-NL"/>
+              </w:rPr>
+              <w:t>Zet het in het groot op de voor pagina</w:t>
+            </w:r>
+          </w:p>
+          <w:p>
+            <w:pPr>
+              <w:spacing w:after="30"/>
+              <w:rPr>
+                <w:lang w:val="nl-NL"/>
+              </w:rPr>
+            </w:pPr>
+          </w:p>
+          <w:p>
+            <w:pPr>
+              <w:spacing w:after="30"/>
+              <w:rPr>
+                <w:lang w:val="nl-NL"/>
+              </w:rPr>
+            </w:pPr>
+          </w:p>
+          <w:p>
+            <w:pPr>
+              <w:spacing w:after="30"/>
+              <w:rPr>
+                <w:lang w:val="nl-NL"/>
+              </w:rPr>
             </w:pPr>
           </w:p>
         </w:tc>
@@ -2968,24 +4007,42 @@
             <w:pPr>
               <w:spacing w:after="30"/>
               <w:jc w:val="center"/>
+              <w:rPr>
+                <w:lang w:val="nl-NL"/>
+              </w:rPr>
             </w:pPr>
           </w:p>
           <w:p>
             <w:pPr>
               <w:spacing w:after="30"/>
               <w:jc w:val="center"/>
-            </w:pPr>
+              <w:rPr>
+                <w:lang w:val="nl-NL"/>
+              </w:rPr>
+            </w:pPr>
+            <w:r>
+              <w:rPr>
+                <w:lang w:val="nl-NL"/>
+              </w:rPr>
+              <w:t>2</w:t>
+            </w:r>
           </w:p>
           <w:p>
             <w:pPr>
               <w:spacing w:after="30"/>
               <w:jc w:val="center"/>
+              <w:rPr>
+                <w:lang w:val="nl-NL"/>
+              </w:rPr>
             </w:pPr>
           </w:p>
           <w:p>
             <w:pPr>
               <w:spacing w:after="30"/>
               <w:jc w:val="center"/>
+              <w:rPr>
+                <w:lang w:val="nl-NL"/>
+              </w:rPr>
             </w:pPr>
           </w:p>
         </w:tc>
@@ -3017,21 +4074,55 @@
           <w:p>
             <w:pPr>
               <w:spacing w:after="30"/>
-            </w:pPr>
-          </w:p>
-          <w:p>
-            <w:pPr>
-              <w:spacing w:after="30"/>
-            </w:pPr>
-          </w:p>
-          <w:p>
-            <w:pPr>
-              <w:spacing w:after="30"/>
-            </w:pPr>
-          </w:p>
-          <w:p>
-            <w:pPr>
-              <w:spacing w:after="30"/>
+              <w:rPr>
+                <w:lang w:val="nl-NL"/>
+              </w:rPr>
+            </w:pPr>
+            <w:proofErr w:type="gramStart"/>
+            <w:r>
+              <w:rPr>
+                <w:lang w:val="nl-NL"/>
+              </w:rPr>
+              <w:t>repareer</w:t>
+            </w:r>
+            <w:proofErr w:type="gramEnd"/>
+            <w:r>
+              <w:rPr>
+                <w:lang w:val="nl-NL"/>
+              </w:rPr>
+              <w:t xml:space="preserve"> de knop om een tafel te boeken</w:t>
+            </w:r>
+          </w:p>
+          <w:p>
+            <w:pPr>
+              <w:spacing w:after="30"/>
+              <w:rPr>
+                <w:lang w:val="nl-NL"/>
+              </w:rPr>
+            </w:pPr>
+          </w:p>
+          <w:p>
+            <w:pPr>
+              <w:spacing w:after="30"/>
+              <w:rPr>
+                <w:lang w:val="nl-NL"/>
+              </w:rPr>
+            </w:pPr>
+          </w:p>
+          <w:p>
+            <w:pPr>
+              <w:spacing w:after="30"/>
+              <w:rPr>
+                <w:lang w:val="nl-NL"/>
+              </w:rPr>
+            </w:pPr>
+          </w:p>
+          <w:p>
+            <w:pPr>
+              <w:spacing w:after="30"/>
+              <w:rPr>
+                <w:lang w:val="nl-NL"/>
+              </w:rPr>
             </w:pPr>
           </w:p>
         </w:tc>
@@ -3042,21 +4133,59 @@
           <w:p>
             <w:pPr>
               <w:spacing w:after="30"/>
-            </w:pPr>
-          </w:p>
-          <w:p>
-            <w:pPr>
-              <w:spacing w:after="30"/>
-            </w:pPr>
-          </w:p>
-          <w:p>
-            <w:pPr>
-              <w:spacing w:after="30"/>
-            </w:pPr>
-          </w:p>
-          <w:p>
-            <w:pPr>
-              <w:spacing w:after="30"/>
+              <w:rPr>
+                <w:lang w:val="nl-NL"/>
+              </w:rPr>
+            </w:pPr>
+            <w:r>
+              <w:rPr>
+                <w:lang w:val="nl-NL"/>
+              </w:rPr>
+              <w:t xml:space="preserve">Ik kan </w:t>
+            </w:r>
+            <w:proofErr w:type="spellStart"/>
+            <w:r>
+              <w:rPr>
+                <w:lang w:val="nl-NL"/>
+              </w:rPr>
+              <w:t>gwn</w:t>
+            </w:r>
+            <w:proofErr w:type="spellEnd"/>
+            <w:r>
+              <w:rPr>
+                <w:lang w:val="nl-NL"/>
+              </w:rPr>
+              <w:t xml:space="preserve"> geen tafel boeken en ik wil snel zijn en als het niet lukt ga ik </w:t>
+            </w:r>
+            <w:proofErr w:type="spellStart"/>
+            <w:r>
+              <w:rPr>
+                <w:lang w:val="nl-NL"/>
+              </w:rPr>
+              <w:t>gwn</w:t>
+            </w:r>
+            <w:proofErr w:type="spellEnd"/>
+            <w:r>
+              <w:rPr>
+                <w:lang w:val="nl-NL"/>
+              </w:rPr>
+              <w:t xml:space="preserve"> weg en kom ik niet meer eten</w:t>
+            </w:r>
+          </w:p>
+          <w:p>
+            <w:pPr>
+              <w:spacing w:after="30"/>
+              <w:rPr>
+                <w:lang w:val="nl-NL"/>
+              </w:rPr>
+            </w:pPr>
+          </w:p>
+          <w:p>
+            <w:pPr>
+              <w:spacing w:after="30"/>
+              <w:rPr>
+                <w:lang w:val="nl-NL"/>
+              </w:rPr>
             </w:pPr>
           </w:p>
         </w:tc>
@@ -3067,21 +4196,45 @@
           <w:p>
             <w:pPr>
               <w:spacing w:after="30"/>
-            </w:pPr>
-          </w:p>
-          <w:p>
-            <w:pPr>
-              <w:spacing w:after="30"/>
-            </w:pPr>
-          </w:p>
-          <w:p>
-            <w:pPr>
-              <w:spacing w:after="30"/>
-            </w:pPr>
-          </w:p>
-          <w:p>
-            <w:pPr>
-              <w:spacing w:after="30"/>
+              <w:rPr>
+                <w:lang w:val="nl-NL"/>
+              </w:rPr>
+            </w:pPr>
+            <w:r>
+              <w:rPr>
+                <w:lang w:val="nl-NL"/>
+              </w:rPr>
+              <w:t xml:space="preserve">Maak het zodat je een tafel kan boeken en je een </w:t>
+            </w:r>
+            <w:proofErr w:type="spellStart"/>
+            <w:r>
+              <w:rPr>
+                <w:lang w:val="nl-NL"/>
+              </w:rPr>
+              <w:t>groote</w:t>
+            </w:r>
+            <w:proofErr w:type="spellEnd"/>
+            <w:r>
+              <w:rPr>
+                <w:lang w:val="nl-NL"/>
+              </w:rPr>
+              <w:t xml:space="preserve"> groene duim krijgt als het is gelukt </w:t>
+            </w:r>
+          </w:p>
+          <w:p>
+            <w:pPr>
+              <w:spacing w:after="30"/>
+              <w:rPr>
+                <w:lang w:val="nl-NL"/>
+              </w:rPr>
+            </w:pPr>
+          </w:p>
+          <w:p>
+            <w:pPr>
+              <w:spacing w:after="30"/>
+              <w:rPr>
+                <w:lang w:val="nl-NL"/>
+              </w:rPr>
             </w:pPr>
           </w:p>
         </w:tc>
@@ -3093,24 +4246,42 @@
             <w:pPr>
               <w:spacing w:after="30"/>
               <w:jc w:val="center"/>
+              <w:rPr>
+                <w:lang w:val="nl-NL"/>
+              </w:rPr>
             </w:pPr>
           </w:p>
           <w:p>
             <w:pPr>
               <w:spacing w:after="30"/>
               <w:jc w:val="center"/>
+              <w:rPr>
+                <w:lang w:val="nl-NL"/>
+              </w:rPr>
             </w:pPr>
           </w:p>
           <w:p>
             <w:pPr>
               <w:spacing w:after="30"/>
               <w:jc w:val="center"/>
-            </w:pPr>
+              <w:rPr>
+                <w:lang w:val="nl-NL"/>
+              </w:rPr>
+            </w:pPr>
+            <w:r>
+              <w:rPr>
+                <w:lang w:val="nl-NL"/>
+              </w:rPr>
+              <w:t>1</w:t>
+            </w:r>
           </w:p>
           <w:p>
             <w:pPr>
               <w:spacing w:after="30"/>
               <w:jc w:val="center"/>
+              <w:rPr>
+                <w:lang w:val="nl-NL"/>
+              </w:rPr>
             </w:pPr>
           </w:p>
         </w:tc>
@@ -3142,21 +4313,39 @@
           <w:p>
             <w:pPr>
               <w:spacing w:after="30"/>
-            </w:pPr>
-          </w:p>
-          <w:p>
-            <w:pPr>
-              <w:spacing w:after="30"/>
-            </w:pPr>
-          </w:p>
-          <w:p>
-            <w:pPr>
-              <w:spacing w:after="30"/>
-            </w:pPr>
-          </w:p>
-          <w:p>
-            <w:pPr>
-              <w:spacing w:after="30"/>
+              <w:rPr>
+                <w:lang w:val="nl-NL"/>
+              </w:rPr>
+            </w:pPr>
+            <w:proofErr w:type="gramStart"/>
+            <w:r>
+              <w:rPr>
+                <w:lang w:val="nl-NL"/>
+              </w:rPr>
+              <w:t>laat</w:t>
+            </w:r>
+            <w:proofErr w:type="gramEnd"/>
+            <w:r>
+              <w:rPr>
+                <w:lang w:val="nl-NL"/>
+              </w:rPr>
+              <w:t xml:space="preserve"> het scrollen stoppen zodat het gekozen onderdeel goed in beeld staat, en zet bij elk pastagerecht een korte beschrijving</w:t>
+            </w:r>
+          </w:p>
+          <w:p>
+            <w:pPr>
+              <w:spacing w:after="30"/>
+              <w:rPr>
+                <w:lang w:val="nl-NL"/>
+              </w:rPr>
+            </w:pPr>
+          </w:p>
+          <w:p>
+            <w:pPr>
+              <w:spacing w:after="30"/>
+              <w:rPr>
+                <w:lang w:val="nl-NL"/>
+              </w:rPr>
             </w:pPr>
           </w:p>
         </w:tc>
@@ -3167,21 +4356,59 @@
           <w:p>
             <w:pPr>
               <w:spacing w:after="30"/>
-            </w:pPr>
-          </w:p>
-          <w:p>
-            <w:pPr>
-              <w:spacing w:after="30"/>
-            </w:pPr>
-          </w:p>
-          <w:p>
-            <w:pPr>
-              <w:spacing w:after="30"/>
-            </w:pPr>
-          </w:p>
-          <w:p>
-            <w:pPr>
-              <w:spacing w:after="30"/>
+              <w:rPr>
+                <w:lang w:val="nl-NL"/>
+              </w:rPr>
+            </w:pPr>
+            <w:r>
+              <w:rPr>
+                <w:lang w:val="nl-NL"/>
+              </w:rPr>
+              <w:t xml:space="preserve">Het is onhandig omdat ik een </w:t>
+            </w:r>
+            <w:proofErr w:type="spellStart"/>
+            <w:r>
+              <w:rPr>
+                <w:lang w:val="nl-NL"/>
+              </w:rPr>
+              <w:t>een</w:t>
+            </w:r>
+            <w:proofErr w:type="spellEnd"/>
+            <w:r>
+              <w:rPr>
+                <w:lang w:val="nl-NL"/>
+              </w:rPr>
+              <w:t xml:space="preserve"> </w:t>
+            </w:r>
+            <w:proofErr w:type="gramStart"/>
+            <w:r>
+              <w:rPr>
+                <w:lang w:val="nl-NL"/>
+              </w:rPr>
+              <w:t>oog opslag</w:t>
+            </w:r>
+            <w:proofErr w:type="gramEnd"/>
+            <w:r>
+              <w:rPr>
+                <w:lang w:val="nl-NL"/>
+              </w:rPr>
+              <w:t xml:space="preserve"> wil zien wat er in een gerecht zit of wat er alm voor drankjes zijn </w:t>
+            </w:r>
+          </w:p>
+          <w:p>
+            <w:pPr>
+              <w:spacing w:after="30"/>
+              <w:rPr>
+                <w:lang w:val="nl-NL"/>
+              </w:rPr>
+            </w:pPr>
+          </w:p>
+          <w:p>
+            <w:pPr>
+              <w:spacing w:after="30"/>
+              <w:rPr>
+                <w:lang w:val="nl-NL"/>
+              </w:rPr>
             </w:pPr>
           </w:p>
         </w:tc>
@@ -3192,21 +4419,59 @@
           <w:p>
             <w:pPr>
               <w:spacing w:after="30"/>
-            </w:pPr>
-          </w:p>
-          <w:p>
-            <w:pPr>
-              <w:spacing w:after="30"/>
-            </w:pPr>
-          </w:p>
-          <w:p>
-            <w:pPr>
-              <w:spacing w:after="30"/>
-            </w:pPr>
-          </w:p>
-          <w:p>
-            <w:pPr>
-              <w:spacing w:after="30"/>
+              <w:rPr>
+                <w:lang w:val="nl-NL"/>
+              </w:rPr>
+            </w:pPr>
+            <w:r>
+              <w:rPr>
+                <w:lang w:val="nl-NL"/>
+              </w:rPr>
+              <w:t xml:space="preserve">Zorg dat het scrollen naar beneden in het midden van het beeld komt en dat je bij de </w:t>
+            </w:r>
+            <w:proofErr w:type="spellStart"/>
+            <w:r>
+              <w:rPr>
+                <w:lang w:val="nl-NL"/>
+              </w:rPr>
+              <w:t>pastas</w:t>
+            </w:r>
+            <w:proofErr w:type="spellEnd"/>
+            <w:r>
+              <w:rPr>
+                <w:lang w:val="nl-NL"/>
+              </w:rPr>
+              <w:t xml:space="preserve"> en andere gerechten erbij zet wat </w:t>
+            </w:r>
+            <w:proofErr w:type="gramStart"/>
+            <w:r>
+              <w:rPr>
+                <w:lang w:val="nl-NL"/>
+              </w:rPr>
+              <w:t>er in</w:t>
+            </w:r>
+            <w:proofErr w:type="gramEnd"/>
+            <w:r>
+              <w:rPr>
+                <w:lang w:val="nl-NL"/>
+              </w:rPr>
+              <w:t xml:space="preserve"> zit</w:t>
+            </w:r>
+          </w:p>
+          <w:p>
+            <w:pPr>
+              <w:spacing w:after="30"/>
+              <w:rPr>
+                <w:lang w:val="nl-NL"/>
+              </w:rPr>
+            </w:pPr>
+          </w:p>
+          <w:p>
+            <w:pPr>
+              <w:spacing w:after="30"/>
+              <w:rPr>
+                <w:lang w:val="nl-NL"/>
+              </w:rPr>
             </w:pPr>
           </w:p>
         </w:tc>
@@ -3218,24 +4483,42 @@
             <w:pPr>
               <w:spacing w:after="30"/>
               <w:jc w:val="center"/>
+              <w:rPr>
+                <w:lang w:val="nl-NL"/>
+              </w:rPr>
             </w:pPr>
           </w:p>
           <w:p>
             <w:pPr>
               <w:spacing w:after="30"/>
               <w:jc w:val="center"/>
+              <w:rPr>
+                <w:lang w:val="nl-NL"/>
+              </w:rPr>
             </w:pPr>
           </w:p>
           <w:p>
             <w:pPr>
               <w:spacing w:after="30"/>
               <w:jc w:val="center"/>
-            </w:pPr>
+              <w:rPr>
+                <w:lang w:val="nl-NL"/>
+              </w:rPr>
+            </w:pPr>
+            <w:r>
+              <w:rPr>
+                <w:lang w:val="nl-NL"/>
+              </w:rPr>
+              <w:t>3</w:t>
+            </w:r>
           </w:p>
           <w:p>
             <w:pPr>
               <w:spacing w:after="30"/>
               <w:jc w:val="center"/>
+              <w:rPr>
+                <w:lang w:val="nl-NL"/>
+              </w:rPr>
             </w:pPr>
           </w:p>
         </w:tc>
@@ -3244,19 +4527,27 @@
     <w:p>
       <w:pPr>
         <w:spacing w:after="140"/>
+        <w:rPr>
+          <w:lang w:val="nl-NL"/>
+        </w:rPr>
       </w:pPr>
     </w:p>
     <w:p>
       <w:pPr>
-        <w:pStyle w:val="Heading2"/>
+        <w:pStyle w:val="Kop2"/>
       </w:pPr>
       <w:r>
-        <w:t>Stap 5: Inleveren</w:t>
-      </w:r>
+        <w:t xml:space="preserve">Stap 5: </w:t>
+      </w:r>
+      <w:proofErr w:type="spellStart"/>
+      <w:r>
+        <w:t>Inleveren</w:t>
+      </w:r>
+      <w:proofErr w:type="spellEnd"/>
     </w:p>
     <w:p>
       <w:pPr>
-        <w:pStyle w:val="ListParagraph"/>
+        <w:pStyle w:val="Lijstalinea"/>
         <w:numPr>
           <w:ilvl w:val="0"/>
           <w:numId w:val="2"/>
@@ -3275,7 +4566,7 @@
     </w:p>
     <w:p>
       <w:pPr>
-        <w:pStyle w:val="ListParagraph"/>
+        <w:pStyle w:val="Lijstalinea"/>
         <w:numPr>
           <w:ilvl w:val="0"/>
           <w:numId w:val="2"/>
@@ -3299,8 +4590,8 @@
       </w:r>
       <w:r>
         <w:rPr>
-          <w:b w:val="1"/>
-          <w:bCs w:val="1"/>
+          <w:b/>
+          <w:bCs/>
           <w:lang w:val="nl-NL"/>
         </w:rPr>
         <w:t>“/evaluatieronde”</w:t>
@@ -3323,12 +4614,14 @@
         </w:rPr>
         <w:t xml:space="preserve"> </w:t>
       </w:r>
+      <w:proofErr w:type="spellStart"/>
       <w:r>
         <w:rPr>
           <w:lang w:val="nl-NL"/>
         </w:rPr>
         <w:t>repository</w:t>
       </w:r>
+      <w:proofErr w:type="spellEnd"/>
       <w:r>
         <w:rPr>
           <w:lang w:val="nl-NL"/>
@@ -3338,7 +4631,7 @@
     </w:p>
     <w:p>
       <w:pPr>
-        <w:pStyle w:val="ListParagraph"/>
+        <w:pStyle w:val="Lijstalinea"/>
         <w:numPr>
           <w:ilvl w:val="0"/>
           <w:numId w:val="2"/>
@@ -3356,7 +4649,7 @@
       </w:r>
     </w:p>
     <w:sectPr>
-      <w:pgSz w:w="12240" w:h="15840" w:orient="portrait"/>
+      <w:pgSz w:w="12240" w:h="15840"/>
       <w:pgMar w:top="1200" w:right="1440" w:bottom="1200" w:left="1440" w:header="708" w:footer="708" w:gutter="0"/>
       <w:cols w:space="720"/>
       <w:docGrid w:linePitch="360"/>
@@ -3366,7 +4659,7 @@
 </file>
 
 <file path=word/numbering.xml><?xml version="1.0" encoding="utf-8"?>
-<w:numbering xmlns:wpc="http://schemas.microsoft.com/office/word/2010/wordprocessingCanvas" xmlns:cx="http://schemas.microsoft.com/office/drawing/2014/chartex" xmlns:cx1="http://schemas.microsoft.com/office/drawing/2015/9/8/chartex" xmlns:cx2="http://schemas.microsoft.com/office/drawing/2015/10/21/chartex" xmlns:cx3="http://schemas.microsoft.com/office/drawing/2016/5/9/chartex" xmlns:cx4="http://schemas.microsoft.com/office/drawing/2016/5/10/chartex" xmlns:cx5="http://schemas.microsoft.com/office/drawing/2016/5/11/chartex" xmlns:cx6="http://schemas.microsoft.com/office/drawing/2016/5/12/chartex" xmlns:cx7="http://schemas.microsoft.com/office/drawing/2016/5/13/chartex" xmlns:cx8="http://schemas.microsoft.com/office/drawing/2016/5/14/chartex" xmlns:mc="http://schemas.openxmlformats.org/markup-compatibility/2006" xmlns:m="http://schemas.openxmlformats.org/officeDocument/2006/math" xmlns:aink="http://schemas.microsoft.com/office/drawing/2016/ink" xmlns:am3d="http://schemas.microsoft.com/office/drawing/2017/model3d" xmlns:oel="http://schemas.microsoft.com/office/2019/extlst" xmlns:r="http://schemas.openxmlformats.org/officeDocument/2006/relationships" xmlns:wp14="http://schemas.microsoft.com/office/word/2010/wordprocessingDrawing" xmlns:wp="http://schemas.openxmlformats.org/drawingml/2006/wordprocessingDrawing" xmlns:wpg="http://schemas.microsoft.com/office/word/2010/wordprocessingGroup" xmlns:wpi="http://schemas.microsoft.com/office/word/2010/wordprocessingInk" xmlns:wps="http://schemas.microsoft.com/office/word/2010/wordprocessingShape" xmlns:o="urn:schemas-microsoft-com:office:office" xmlns:v="urn:schemas-microsoft-com:vml" xmlns:w10="urn:schemas-microsoft-com:office:word" xmlns:w="http://schemas.openxmlformats.org/wordprocessingml/2006/main" xmlns:w14="http://schemas.microsoft.com/office/word/2010/wordml" xmlns:w15="http://schemas.microsoft.com/office/word/2012/wordml" xmlns:w16cex="http://schemas.microsoft.com/office/word/2018/wordml/cex" xmlns:w16cid="http://schemas.microsoft.com/office/word/2016/wordml/cid" xmlns:w16="http://schemas.microsoft.com/office/word/2018/wordml" xmlns:w16sdtdh="http://schemas.microsoft.com/office/word/2020/wordml/sdtdatahash" xmlns:w16sdtfl="http://schemas.microsoft.com/office/word/2024/wordml/sdtformatlock" xmlns:w16se="http://schemas.microsoft.com/office/word/2015/wordml/symex" xmlns:w16du="http://schemas.microsoft.com/office/word/2023/wordml/word16du" xmlns:wne="http://schemas.microsoft.com/office/word/2006/wordml" mc:Ignorable="w14 w15 w16se w16cid w16 w16cex w16sdtdh w16sdtfl w16du wp14">
+<w:numbering xmlns:wpc="http://schemas.microsoft.com/office/word/2010/wordprocessingCanvas" xmlns:cx="http://schemas.microsoft.com/office/drawing/2014/chartex" xmlns:cx1="http://schemas.microsoft.com/office/drawing/2015/9/8/chartex" xmlns:cx2="http://schemas.microsoft.com/office/drawing/2015/10/21/chartex" xmlns:cx3="http://schemas.microsoft.com/office/drawing/2016/5/9/chartex" xmlns:cx4="http://schemas.microsoft.com/office/drawing/2016/5/10/chartex" xmlns:cx5="http://schemas.microsoft.com/office/drawing/2016/5/11/chartex" xmlns:cx6="http://schemas.microsoft.com/office/drawing/2016/5/12/chartex" xmlns:cx7="http://schemas.microsoft.com/office/drawing/2016/5/13/chartex" xmlns:cx8="http://schemas.microsoft.com/office/drawing/2016/5/14/chartex" xmlns:mc="http://schemas.openxmlformats.org/markup-compatibility/2006" xmlns:aink="http://schemas.microsoft.com/office/drawing/2016/ink" xmlns:am3d="http://schemas.microsoft.com/office/drawing/2017/model3d" xmlns:o="urn:schemas-microsoft-com:office:office" xmlns:oel="http://schemas.microsoft.com/office/2019/extlst" xmlns:r="http://schemas.openxmlformats.org/officeDocument/2006/relationships" xmlns:m="http://schemas.openxmlformats.org/officeDocument/2006/math" xmlns:v="urn:schemas-microsoft-com:vml" xmlns:wp14="http://schemas.microsoft.com/office/word/2010/wordprocessingDrawing" xmlns:wp="http://schemas.openxmlformats.org/drawingml/2006/wordprocessingDrawing" xmlns:w10="urn:schemas-microsoft-com:office:word" xmlns:w="http://schemas.openxmlformats.org/wordprocessingml/2006/main" xmlns:w14="http://schemas.microsoft.com/office/word/2010/wordml" xmlns:w15="http://schemas.microsoft.com/office/word/2012/wordml" xmlns:w16cex="http://schemas.microsoft.com/office/word/2018/wordml/cex" xmlns:w16cid="http://schemas.microsoft.com/office/word/2016/wordml/cid" xmlns:w16="http://schemas.microsoft.com/office/word/2018/wordml" xmlns:w16du="http://schemas.microsoft.com/office/word/2023/wordml/word16du" xmlns:w16sdtdh="http://schemas.microsoft.com/office/word/2020/wordml/sdtdatahash" xmlns:w16sdtfl="http://schemas.microsoft.com/office/word/2024/wordml/sdtformatlock" xmlns:w16se="http://schemas.microsoft.com/office/word/2015/wordml/symex" xmlns:wpg="http://schemas.microsoft.com/office/word/2010/wordprocessingGroup" xmlns:wpi="http://schemas.microsoft.com/office/word/2010/wordprocessingInk" xmlns:wne="http://schemas.microsoft.com/office/word/2006/wordml" xmlns:wps="http://schemas.microsoft.com/office/word/2010/wordprocessingShape" mc:Ignorable="w14 w15 w16se w16cid w16 w16cex w16sdtdh w16sdtfl w16du wp14">
   <w:abstractNum w:abstractNumId="0" w15:restartNumberingAfterBreak="0">
     <w:nsid w:val="2BAD4A8F"/>
     <w:multiLevelType w:val="hybridMultilevel"/>
@@ -3577,11 +4870,11 @@
 </file>
 
 <file path=word/styles.xml><?xml version="1.0" encoding="utf-8"?>
-<w:styles xmlns:mc="http://schemas.openxmlformats.org/markup-compatibility/2006" xmlns:r="http://schemas.openxmlformats.org/officeDocument/2006/relationships" xmlns:w="http://schemas.openxmlformats.org/wordprocessingml/2006/main" xmlns:w14="http://schemas.microsoft.com/office/word/2010/wordml" xmlns:w15="http://schemas.microsoft.com/office/word/2012/wordml" xmlns:w16cex="http://schemas.microsoft.com/office/word/2018/wordml/cex" xmlns:w16cid="http://schemas.microsoft.com/office/word/2016/wordml/cid" xmlns:w16="http://schemas.microsoft.com/office/word/2018/wordml" xmlns:w16sdtdh="http://schemas.microsoft.com/office/word/2020/wordml/sdtdatahash" xmlns:w16sdtfl="http://schemas.microsoft.com/office/word/2024/wordml/sdtformatlock" xmlns:w16se="http://schemas.microsoft.com/office/word/2015/wordml/symex" xmlns:w16du="http://schemas.microsoft.com/office/word/2023/wordml/word16du" mc:Ignorable="w14 w15 w16se w16cid w16 w16cex w16sdtdh w16sdtfl w16du">
+<w:styles xmlns:mc="http://schemas.openxmlformats.org/markup-compatibility/2006" xmlns:r="http://schemas.openxmlformats.org/officeDocument/2006/relationships" xmlns:w="http://schemas.openxmlformats.org/wordprocessingml/2006/main" xmlns:w14="http://schemas.microsoft.com/office/word/2010/wordml" xmlns:w15="http://schemas.microsoft.com/office/word/2012/wordml" xmlns:w16cex="http://schemas.microsoft.com/office/word/2018/wordml/cex" xmlns:w16cid="http://schemas.microsoft.com/office/word/2016/wordml/cid" xmlns:w16="http://schemas.microsoft.com/office/word/2018/wordml" xmlns:w16du="http://schemas.microsoft.com/office/word/2023/wordml/word16du" xmlns:w16sdtdh="http://schemas.microsoft.com/office/word/2020/wordml/sdtdatahash" xmlns:w16sdtfl="http://schemas.microsoft.com/office/word/2024/wordml/sdtformatlock" xmlns:w16se="http://schemas.microsoft.com/office/word/2015/wordml/symex" mc:Ignorable="w14 w15 w16se w16cid w16 w16cex w16sdtdh w16sdtfl w16du">
   <w:docDefaults>
     <w:rPrDefault>
       <w:rPr>
-        <w:rFonts w:ascii="Times New Roman" w:hAnsi="Times New Roman" w:eastAsia="Times New Roman" w:cs="Times New Roman"/>
+        <w:rFonts w:ascii="Times New Roman" w:eastAsia="Times New Roman" w:hAnsi="Times New Roman" w:cs="Times New Roman"/>
         <w:lang w:val="en-US" w:eastAsia="en-US" w:bidi="ar-SA"/>
       </w:rPr>
     </w:rPrDefault>
@@ -3590,14 +4883,14 @@
   <w:latentStyles w:defLockedState="0" w:defUIPriority="99" w:defSemiHidden="0" w:defUnhideWhenUsed="0" w:defQFormat="0" w:count="376">
     <w:lsdException w:name="Normal" w:uiPriority="0" w:qFormat="1"/>
     <w:lsdException w:name="heading 1" w:uiPriority="9" w:qFormat="1"/>
-    <w:lsdException w:name="heading 2" w:uiPriority="9" w:semiHidden="1" w:unhideWhenUsed="1" w:qFormat="1"/>
-    <w:lsdException w:name="heading 3" w:uiPriority="9" w:semiHidden="1" w:unhideWhenUsed="1" w:qFormat="1"/>
-    <w:lsdException w:name="heading 4" w:uiPriority="9" w:semiHidden="1" w:unhideWhenUsed="1" w:qFormat="1"/>
-    <w:lsdException w:name="heading 5" w:uiPriority="9" w:semiHidden="1" w:unhideWhenUsed="1" w:qFormat="1"/>
-    <w:lsdException w:name="heading 6" w:uiPriority="9" w:semiHidden="1" w:unhideWhenUsed="1" w:qFormat="1"/>
-    <w:lsdException w:name="heading 7" w:uiPriority="9" w:semiHidden="1" w:unhideWhenUsed="1" w:qFormat="1"/>
-    <w:lsdException w:name="heading 8" w:uiPriority="9" w:semiHidden="1" w:unhideWhenUsed="1" w:qFormat="1"/>
-    <w:lsdException w:name="heading 9" w:uiPriority="9" w:semiHidden="1" w:unhideWhenUsed="1" w:qFormat="1"/>
+    <w:lsdException w:name="heading 2" w:semiHidden="1" w:uiPriority="9" w:unhideWhenUsed="1" w:qFormat="1"/>
+    <w:lsdException w:name="heading 3" w:semiHidden="1" w:uiPriority="9" w:unhideWhenUsed="1" w:qFormat="1"/>
+    <w:lsdException w:name="heading 4" w:semiHidden="1" w:uiPriority="9" w:unhideWhenUsed="1" w:qFormat="1"/>
+    <w:lsdException w:name="heading 5" w:semiHidden="1" w:uiPriority="9" w:unhideWhenUsed="1" w:qFormat="1"/>
+    <w:lsdException w:name="heading 6" w:semiHidden="1" w:uiPriority="9" w:unhideWhenUsed="1" w:qFormat="1"/>
+    <w:lsdException w:name="heading 7" w:semiHidden="1" w:uiPriority="9" w:unhideWhenUsed="1" w:qFormat="1"/>
+    <w:lsdException w:name="heading 8" w:semiHidden="1" w:uiPriority="9" w:unhideWhenUsed="1" w:qFormat="1"/>
+    <w:lsdException w:name="heading 9" w:semiHidden="1" w:uiPriority="9" w:unhideWhenUsed="1" w:qFormat="1"/>
     <w:lsdException w:name="index 1" w:semiHidden="1" w:unhideWhenUsed="1"/>
     <w:lsdException w:name="index 2" w:semiHidden="1" w:unhideWhenUsed="1"/>
     <w:lsdException w:name="index 3" w:semiHidden="1" w:unhideWhenUsed="1"/>
@@ -3607,22 +4900,22 @@
     <w:lsdException w:name="index 7" w:semiHidden="1" w:unhideWhenUsed="1"/>
     <w:lsdException w:name="index 8" w:semiHidden="1" w:unhideWhenUsed="1"/>
     <w:lsdException w:name="index 9" w:semiHidden="1" w:unhideWhenUsed="1"/>
-    <w:lsdException w:name="toc 1" w:uiPriority="39" w:semiHidden="1" w:unhideWhenUsed="1"/>
-    <w:lsdException w:name="toc 2" w:uiPriority="39" w:semiHidden="1" w:unhideWhenUsed="1"/>
-    <w:lsdException w:name="toc 3" w:uiPriority="39" w:semiHidden="1" w:unhideWhenUsed="1"/>
-    <w:lsdException w:name="toc 4" w:uiPriority="39" w:semiHidden="1" w:unhideWhenUsed="1"/>
-    <w:lsdException w:name="toc 5" w:uiPriority="39" w:semiHidden="1" w:unhideWhenUsed="1"/>
-    <w:lsdException w:name="toc 6" w:uiPriority="39" w:semiHidden="1" w:unhideWhenUsed="1"/>
-    <w:lsdException w:name="toc 7" w:uiPriority="39" w:semiHidden="1" w:unhideWhenUsed="1"/>
-    <w:lsdException w:name="toc 8" w:uiPriority="39" w:semiHidden="1" w:unhideWhenUsed="1"/>
-    <w:lsdException w:name="toc 9" w:uiPriority="39" w:semiHidden="1" w:unhideWhenUsed="1"/>
+    <w:lsdException w:name="toc 1" w:semiHidden="1" w:uiPriority="39" w:unhideWhenUsed="1"/>
+    <w:lsdException w:name="toc 2" w:semiHidden="1" w:uiPriority="39" w:unhideWhenUsed="1"/>
+    <w:lsdException w:name="toc 3" w:semiHidden="1" w:uiPriority="39" w:unhideWhenUsed="1"/>
+    <w:lsdException w:name="toc 4" w:semiHidden="1" w:uiPriority="39" w:unhideWhenUsed="1"/>
+    <w:lsdException w:name="toc 5" w:semiHidden="1" w:uiPriority="39" w:unhideWhenUsed="1"/>
+    <w:lsdException w:name="toc 6" w:semiHidden="1" w:uiPriority="39" w:unhideWhenUsed="1"/>
+    <w:lsdException w:name="toc 7" w:semiHidden="1" w:uiPriority="39" w:unhideWhenUsed="1"/>
+    <w:lsdException w:name="toc 8" w:semiHidden="1" w:uiPriority="39" w:unhideWhenUsed="1"/>
+    <w:lsdException w:name="toc 9" w:semiHidden="1" w:uiPriority="39" w:unhideWhenUsed="1"/>
     <w:lsdException w:name="Normal Indent" w:semiHidden="1" w:unhideWhenUsed="1"/>
     <w:lsdException w:name="footnote text" w:semiHidden="1" w:unhideWhenUsed="1"/>
     <w:lsdException w:name="annotation text" w:semiHidden="1" w:unhideWhenUsed="1"/>
     <w:lsdException w:name="header" w:semiHidden="1" w:unhideWhenUsed="1"/>
     <w:lsdException w:name="footer" w:semiHidden="1" w:unhideWhenUsed="1"/>
     <w:lsdException w:name="index heading" w:semiHidden="1" w:unhideWhenUsed="1"/>
-    <w:lsdException w:name="caption" w:uiPriority="35" w:semiHidden="1" w:unhideWhenUsed="1" w:qFormat="1"/>
+    <w:lsdException w:name="caption" w:semiHidden="1" w:uiPriority="35" w:unhideWhenUsed="1" w:qFormat="1"/>
     <w:lsdException w:name="table of figures" w:semiHidden="1" w:unhideWhenUsed="1"/>
     <w:lsdException w:name="envelope address" w:semiHidden="1" w:unhideWhenUsed="1"/>
     <w:lsdException w:name="envelope return" w:semiHidden="1" w:unhideWhenUsed="1"/>
@@ -3653,7 +4946,7 @@
     <w:lsdException w:name="Title" w:uiPriority="10" w:qFormat="1"/>
     <w:lsdException w:name="Closing" w:semiHidden="1" w:unhideWhenUsed="1"/>
     <w:lsdException w:name="Signature" w:semiHidden="1" w:unhideWhenUsed="1"/>
-    <w:lsdException w:name="Default Paragraph Font" w:uiPriority="1" w:semiHidden="1" w:unhideWhenUsed="1"/>
+    <w:lsdException w:name="Default Paragraph Font" w:semiHidden="1" w:uiPriority="1" w:unhideWhenUsed="1"/>
     <w:lsdException w:name="Body Text" w:semiHidden="1" w:unhideWhenUsed="1"/>
     <w:lsdException w:name="Body Text Indent" w:semiHidden="1" w:unhideWhenUsed="1"/>
     <w:lsdException w:name="List Continue" w:semiHidden="1" w:unhideWhenUsed="1"/>
@@ -3853,8 +5146,8 @@
     <w:lsdException w:name="Subtle Reference" w:uiPriority="31" w:qFormat="1"/>
     <w:lsdException w:name="Intense Reference" w:uiPriority="32" w:qFormat="1"/>
     <w:lsdException w:name="Book Title" w:uiPriority="33" w:qFormat="1"/>
-    <w:lsdException w:name="Bibliography" w:uiPriority="37" w:semiHidden="1" w:unhideWhenUsed="1"/>
-    <w:lsdException w:name="TOC Heading" w:uiPriority="39" w:semiHidden="1" w:unhideWhenUsed="1" w:qFormat="1"/>
+    <w:lsdException w:name="Bibliography" w:semiHidden="1" w:uiPriority="37" w:unhideWhenUsed="1"/>
+    <w:lsdException w:name="TOC Heading" w:semiHidden="1" w:uiPriority="39" w:unhideWhenUsed="1" w:qFormat="1"/>
     <w:lsdException w:name="Plain Table 1" w:uiPriority="41"/>
     <w:lsdException w:name="Plain Table 2" w:uiPriority="42"/>
     <w:lsdException w:name="Plain Table 3" w:uiPriority="43"/>
@@ -3965,11 +5258,11 @@
     <w:lsdException w:name="Unresolved Mention" w:semiHidden="1" w:unhideWhenUsed="1"/>
     <w:lsdException w:name="Smart Link" w:semiHidden="1" w:unhideWhenUsed="1"/>
   </w:latentStyles>
-  <w:style w:type="paragraph" w:styleId="Normal" w:default="1">
+  <w:style w:type="paragraph" w:default="1" w:styleId="Standaard">
     <w:name w:val="Normal"/>
     <w:qFormat/>
   </w:style>
-  <w:style w:type="paragraph" w:styleId="Heading1">
+  <w:style w:type="paragraph" w:styleId="Kop1">
     <w:name w:val="heading 1"/>
     <w:uiPriority w:val="9"/>
     <w:qFormat/>
@@ -3982,7 +5275,7 @@
       <w:szCs w:val="32"/>
     </w:rPr>
   </w:style>
-  <w:style w:type="paragraph" w:styleId="Heading2">
+  <w:style w:type="paragraph" w:styleId="Kop2">
     <w:name w:val="heading 2"/>
     <w:uiPriority w:val="9"/>
     <w:unhideWhenUsed/>
@@ -3996,7 +5289,7 @@
       <w:szCs w:val="26"/>
     </w:rPr>
   </w:style>
-  <w:style w:type="paragraph" w:styleId="Heading3">
+  <w:style w:type="paragraph" w:styleId="Kop3">
     <w:name w:val="heading 3"/>
     <w:uiPriority w:val="9"/>
     <w:unhideWhenUsed/>
@@ -4010,7 +5303,7 @@
       <w:szCs w:val="24"/>
     </w:rPr>
   </w:style>
-  <w:style w:type="paragraph" w:styleId="Heading4">
+  <w:style w:type="paragraph" w:styleId="Kop4">
     <w:name w:val="heading 4"/>
     <w:uiPriority w:val="9"/>
     <w:semiHidden/>
@@ -4025,7 +5318,7 @@
       <w:color w:val="2E74B5"/>
     </w:rPr>
   </w:style>
-  <w:style w:type="paragraph" w:styleId="Heading5">
+  <w:style w:type="paragraph" w:styleId="Kop5">
     <w:name w:val="heading 5"/>
     <w:uiPriority w:val="9"/>
     <w:semiHidden/>
@@ -4038,7 +5331,7 @@
       <w:color w:val="2E74B5"/>
     </w:rPr>
   </w:style>
-  <w:style w:type="paragraph" w:styleId="Heading6">
+  <w:style w:type="paragraph" w:styleId="Kop6">
     <w:name w:val="heading 6"/>
     <w:uiPriority w:val="9"/>
     <w:semiHidden/>
@@ -4051,13 +5344,12 @@
       <w:color w:val="1F4D78"/>
     </w:rPr>
   </w:style>
-  <w:style w:type="character" w:styleId="DefaultParagraphFont" w:default="1">
+  <w:style w:type="character" w:default="1" w:styleId="Standaardalinea-lettertype">
     <w:name w:val="Default Paragraph Font"/>
     <w:uiPriority w:val="1"/>
-    <w:semiHidden/>
     <w:unhideWhenUsed/>
   </w:style>
-  <w:style w:type="table" w:styleId="TableNormal" w:default="1">
+  <w:style w:type="table" w:default="1" w:styleId="Standaardtabel">
     <w:name w:val="Normal Table"/>
     <w:uiPriority w:val="99"/>
     <w:semiHidden/>
@@ -4072,13 +5364,13 @@
       </w:tblCellMar>
     </w:tblPr>
   </w:style>
-  <w:style w:type="numbering" w:styleId="NoList" w:default="1">
+  <w:style w:type="numbering" w:default="1" w:styleId="Geenlijst">
     <w:name w:val="No List"/>
     <w:uiPriority w:val="99"/>
     <w:semiHidden/>
     <w:unhideWhenUsed/>
   </w:style>
-  <w:style w:type="paragraph" w:styleId="Title">
+  <w:style w:type="paragraph" w:styleId="Titel">
     <w:name w:val="Title"/>
     <w:uiPriority w:val="10"/>
     <w:qFormat/>
@@ -4087,7 +5379,7 @@
       <w:szCs w:val="56"/>
     </w:rPr>
   </w:style>
-  <w:style w:type="paragraph" w:styleId="Strong1" w:customStyle="1">
+  <w:style w:type="paragraph" w:customStyle="1" w:styleId="Strong1">
     <w:name w:val="Strong1"/>
     <w:qFormat/>
     <w:rPr>
@@ -4095,7 +5387,7 @@
       <w:bCs/>
     </w:rPr>
   </w:style>
-  <w:style w:type="paragraph" w:styleId="ListParagraph">
+  <w:style w:type="paragraph" w:styleId="Lijstalinea">
     <w:name w:val="List Paragraph"/>
     <w:qFormat/>
   </w:style>
@@ -4108,7 +5400,7 @@
       <w:u w:val="single"/>
     </w:rPr>
   </w:style>
-  <w:style w:type="character" w:styleId="FootnoteReference">
+  <w:style w:type="character" w:styleId="Voetnootmarkering">
     <w:name w:val="footnote reference"/>
     <w:uiPriority w:val="99"/>
     <w:semiHidden/>
@@ -4117,16 +5409,16 @@
       <w:vertAlign w:val="superscript"/>
     </w:rPr>
   </w:style>
-  <w:style w:type="paragraph" w:styleId="FootnoteText">
+  <w:style w:type="paragraph" w:styleId="Voetnoottekst">
     <w:name w:val="footnote text"/>
-    <w:link w:val="FootnoteTextChar"/>
+    <w:link w:val="VoetnoottekstChar"/>
     <w:uiPriority w:val="99"/>
     <w:semiHidden/>
     <w:unhideWhenUsed/>
   </w:style>
-  <w:style w:type="character" w:styleId="FootnoteTextChar" w:customStyle="1">
-    <w:name w:val="Footnote Text Char"/>
-    <w:link w:val="FootnoteText"/>
+  <w:style w:type="character" w:customStyle="1" w:styleId="VoetnoottekstChar">
+    <w:name w:val="Voetnoottekst Char"/>
+    <w:link w:val="Voetnoottekst"/>
     <w:uiPriority w:val="99"/>
     <w:semiHidden/>
     <w:unhideWhenUsed/>
@@ -4135,7 +5427,7 @@
       <w:szCs w:val="20"/>
     </w:rPr>
   </w:style>
-  <w:style w:type="character" w:styleId="EndnoteReference">
+  <w:style w:type="character" w:styleId="Eindnootmarkering">
     <w:name w:val="endnote reference"/>
     <w:uiPriority w:val="99"/>
     <w:semiHidden/>
@@ -4144,16 +5436,16 @@
       <w:vertAlign w:val="superscript"/>
     </w:rPr>
   </w:style>
-  <w:style w:type="paragraph" w:styleId="EndnoteText">
+  <w:style w:type="paragraph" w:styleId="Eindnoottekst">
     <w:name w:val="endnote text"/>
-    <w:link w:val="EndnoteTextChar"/>
+    <w:link w:val="EindnoottekstChar"/>
     <w:uiPriority w:val="99"/>
     <w:semiHidden/>
     <w:unhideWhenUsed/>
   </w:style>
-  <w:style w:type="character" w:styleId="EndnoteTextChar" w:customStyle="1">
-    <w:name w:val="Endnote Text Char"/>
-    <w:link w:val="EndnoteText"/>
+  <w:style w:type="character" w:customStyle="1" w:styleId="EindnoottekstChar">
+    <w:name w:val="Eindnoottekst Char"/>
+    <w:link w:val="Eindnoottekst"/>
     <w:uiPriority w:val="99"/>
     <w:semiHidden/>
     <w:unhideWhenUsed/>
@@ -4162,17 +5454,17 @@
       <w:szCs w:val="20"/>
     </w:rPr>
   </w:style>
-  <w:style w:type="table" w:styleId="PlainTable2">
+  <w:style w:type="table" w:styleId="Onopgemaaktetabel2">
     <w:name w:val="Plain Table 2"/>
-    <w:basedOn w:val="TableNormal"/>
+    <w:basedOn w:val="Standaardtabel"/>
     <w:uiPriority w:val="42"/>
     <w:rsid w:val="00DB746E"/>
     <w:tblPr>
       <w:tblStyleRowBandSize w:val="1"/>
       <w:tblStyleColBandSize w:val="1"/>
       <w:tblBorders>
-        <w:top w:val="single" w:color="7F7F7F" w:themeColor="text1" w:themeTint="80" w:sz="4" w:space="0"/>
-        <w:bottom w:val="single" w:color="7F7F7F" w:themeColor="text1" w:themeTint="80" w:sz="4" w:space="0"/>
+        <w:top w:val="single" w:sz="4" w:space="0" w:color="7F7F7F" w:themeColor="text1" w:themeTint="80"/>
+        <w:bottom w:val="single" w:sz="4" w:space="0" w:color="7F7F7F" w:themeColor="text1" w:themeTint="80"/>
       </w:tblBorders>
     </w:tblPr>
     <w:tblStylePr w:type="firstRow">
@@ -4183,7 +5475,7 @@
       <w:tblPr/>
       <w:tcPr>
         <w:tcBorders>
-          <w:bottom w:val="single" w:color="7F7F7F" w:themeColor="text1" w:themeTint="80" w:sz="4" w:space="0"/>
+          <w:bottom w:val="single" w:sz="4" w:space="0" w:color="7F7F7F" w:themeColor="text1" w:themeTint="80"/>
         </w:tcBorders>
       </w:tcPr>
     </w:tblStylePr>
@@ -4195,7 +5487,7 @@
       <w:tblPr/>
       <w:tcPr>
         <w:tcBorders>
-          <w:top w:val="single" w:color="7F7F7F" w:themeColor="text1" w:themeTint="80" w:sz="4" w:space="0"/>
+          <w:top w:val="single" w:sz="4" w:space="0" w:color="7F7F7F" w:themeColor="text1" w:themeTint="80"/>
         </w:tcBorders>
       </w:tcPr>
     </w:tblStylePr>
@@ -4215,8 +5507,8 @@
       <w:tblPr/>
       <w:tcPr>
         <w:tcBorders>
-          <w:left w:val="single" w:color="7F7F7F" w:themeColor="text1" w:themeTint="80" w:sz="4" w:space="0"/>
-          <w:right w:val="single" w:color="7F7F7F" w:themeColor="text1" w:themeTint="80" w:sz="4" w:space="0"/>
+          <w:left w:val="single" w:sz="4" w:space="0" w:color="7F7F7F" w:themeColor="text1" w:themeTint="80"/>
+          <w:right w:val="single" w:sz="4" w:space="0" w:color="7F7F7F" w:themeColor="text1" w:themeTint="80"/>
         </w:tcBorders>
       </w:tcPr>
     </w:tblStylePr>
@@ -4224,8 +5516,8 @@
       <w:tblPr/>
       <w:tcPr>
         <w:tcBorders>
-          <w:left w:val="single" w:color="7F7F7F" w:themeColor="text1" w:themeTint="80" w:sz="4" w:space="0"/>
-          <w:right w:val="single" w:color="7F7F7F" w:themeColor="text1" w:themeTint="80" w:sz="4" w:space="0"/>
+          <w:left w:val="single" w:sz="4" w:space="0" w:color="7F7F7F" w:themeColor="text1" w:themeTint="80"/>
+          <w:right w:val="single" w:sz="4" w:space="0" w:color="7F7F7F" w:themeColor="text1" w:themeTint="80"/>
         </w:tcBorders>
       </w:tcPr>
     </w:tblStylePr>
@@ -4233,27 +5525,27 @@
       <w:tblPr/>
       <w:tcPr>
         <w:tcBorders>
-          <w:top w:val="single" w:color="7F7F7F" w:themeColor="text1" w:themeTint="80" w:sz="4" w:space="0"/>
-          <w:bottom w:val="single" w:color="7F7F7F" w:themeColor="text1" w:themeTint="80" w:sz="4" w:space="0"/>
+          <w:top w:val="single" w:sz="4" w:space="0" w:color="7F7F7F" w:themeColor="text1" w:themeTint="80"/>
+          <w:bottom w:val="single" w:sz="4" w:space="0" w:color="7F7F7F" w:themeColor="text1" w:themeTint="80"/>
         </w:tcBorders>
       </w:tcPr>
     </w:tblStylePr>
   </w:style>
-  <w:style w:type="table" w:styleId="GridTable1Light">
+  <w:style w:type="table" w:styleId="Rastertabel1licht">
     <w:name w:val="Grid Table 1 Light"/>
-    <w:basedOn w:val="TableNormal"/>
+    <w:basedOn w:val="Standaardtabel"/>
     <w:uiPriority w:val="46"/>
     <w:rsid w:val="00ED53B6"/>
     <w:tblPr>
       <w:tblStyleRowBandSize w:val="1"/>
       <w:tblStyleColBandSize w:val="1"/>
       <w:tblBorders>
-        <w:top w:val="single" w:color="999999" w:themeColor="text1" w:themeTint="66" w:sz="4" w:space="0"/>
-        <w:left w:val="single" w:color="999999" w:themeColor="text1" w:themeTint="66" w:sz="4" w:space="0"/>
-        <w:bottom w:val="single" w:color="999999" w:themeColor="text1" w:themeTint="66" w:sz="4" w:space="0"/>
-        <w:right w:val="single" w:color="999999" w:themeColor="text1" w:themeTint="66" w:sz="4" w:space="0"/>
-        <w:insideH w:val="single" w:color="999999" w:themeColor="text1" w:themeTint="66" w:sz="4" w:space="0"/>
-        <w:insideV w:val="single" w:color="999999" w:themeColor="text1" w:themeTint="66" w:sz="4" w:space="0"/>
+        <w:top w:val="single" w:sz="4" w:space="0" w:color="999999" w:themeColor="text1" w:themeTint="66"/>
+        <w:left w:val="single" w:sz="4" w:space="0" w:color="999999" w:themeColor="text1" w:themeTint="66"/>
+        <w:bottom w:val="single" w:sz="4" w:space="0" w:color="999999" w:themeColor="text1" w:themeTint="66"/>
+        <w:right w:val="single" w:sz="4" w:space="0" w:color="999999" w:themeColor="text1" w:themeTint="66"/>
+        <w:insideH w:val="single" w:sz="4" w:space="0" w:color="999999" w:themeColor="text1" w:themeTint="66"/>
+        <w:insideV w:val="single" w:sz="4" w:space="0" w:color="999999" w:themeColor="text1" w:themeTint="66"/>
       </w:tblBorders>
     </w:tblPr>
     <w:tblStylePr w:type="firstRow">
@@ -4264,7 +5556,7 @@
       <w:tblPr/>
       <w:tcPr>
         <w:tcBorders>
-          <w:bottom w:val="single" w:color="666666" w:themeColor="text1" w:themeTint="99" w:sz="12" w:space="0"/>
+          <w:bottom w:val="single" w:sz="12" w:space="0" w:color="666666" w:themeColor="text1" w:themeTint="99"/>
         </w:tcBorders>
       </w:tcPr>
     </w:tblStylePr>
@@ -4276,7 +5568,7 @@
       <w:tblPr/>
       <w:tcPr>
         <w:tcBorders>
-          <w:top w:val="double" w:color="666666" w:themeColor="text1" w:themeTint="99" w:sz="2" w:space="0"/>
+          <w:top w:val="double" w:sz="2" w:space="0" w:color="666666" w:themeColor="text1" w:themeTint="99"/>
         </w:tcBorders>
       </w:tcPr>
     </w:tblStylePr>
@@ -4297,7 +5589,7 @@
 </file>
 
 <file path=word/theme/theme1.xml><?xml version="1.0" encoding="utf-8"?>
-<a:theme xmlns:a="http://schemas.openxmlformats.org/drawingml/2006/main" xmlns:thm15="http://schemas.microsoft.com/office/thememl/2012/main" name="Office Theme">
+<a:theme xmlns:a="http://schemas.openxmlformats.org/drawingml/2006/main" name="Office Theme">
   <a:themeElements>
     <a:clrScheme name="Office">
       <a:dk1>
@@ -4612,6 +5904,21 @@
 </file>
 
 <file path=customXml/item1.xml><?xml version="1.0" encoding="utf-8"?>
+<p:properties xmlns:p="http://schemas.microsoft.com/office/2006/metadata/properties" xmlns:xsi="http://www.w3.org/2001/XMLSchema-instance" xmlns:pc="http://schemas.microsoft.com/office/infopath/2007/PartnerControls">
+  <documentManagement/>
+</p:properties>
+</file>
+
+<file path=customXml/item2.xml><?xml version="1.0" encoding="utf-8"?>
+<?mso-contentType ?>
+<FormTemplates xmlns="http://schemas.microsoft.com/sharepoint/v3/contenttype/forms">
+  <Display>DocumentLibraryForm</Display>
+  <Edit>DocumentLibraryForm</Edit>
+  <New>DocumentLibraryForm</New>
+</FormTemplates>
+</file>
+
+<file path=customXml/item3.xml><?xml version="1.0" encoding="utf-8"?>
 <ct:contentTypeSchema xmlns:ct="http://schemas.microsoft.com/office/2006/metadata/contentType" xmlns:ma="http://schemas.microsoft.com/office/2006/metadata/properties/metaAttributes" ct:_="" ma:_="" ma:contentTypeName="Document" ma:contentTypeID="0x010100A7F4956C6D26F244B4687F0836342D5F" ma:contentTypeVersion="3" ma:contentTypeDescription="Create a new document." ma:contentTypeScope="" ma:versionID="8f3865bd13b27ed2b5640c3139fc0e8a">
   <xsd:schema xmlns:xsd="http://www.w3.org/2001/XMLSchema" xmlns:xs="http://www.w3.org/2001/XMLSchema" xmlns:p="http://schemas.microsoft.com/office/2006/metadata/properties" xmlns:ns2="987922cb-a795-4921-bf07-501f462bec56" targetNamespace="http://schemas.microsoft.com/office/2006/metadata/properties" ma:root="true" ma:fieldsID="2e3d7986ca0ca61f5cce0791d076cf8d" ns2:_="">
     <xsd:import namespace="987922cb-a795-4921-bf07-501f462bec56"/>
@@ -4749,29 +6056,37 @@
 </ct:contentTypeSchema>
 </file>
 
-<file path=customXml/item2.xml><?xml version="1.0" encoding="utf-8"?>
-<?mso-contentType ?>
-<FormTemplates xmlns="http://schemas.microsoft.com/sharepoint/v3/contenttype/forms">
-  <Display>DocumentLibraryForm</Display>
-  <Edit>DocumentLibraryForm</Edit>
-  <New>DocumentLibraryForm</New>
-</FormTemplates>
-</file>
-
-<file path=customXml/item3.xml><?xml version="1.0" encoding="utf-8"?>
-<p:properties xmlns:p="http://schemas.microsoft.com/office/2006/metadata/properties" xmlns:xsi="http://www.w3.org/2001/XMLSchema-instance" xmlns:pc="http://schemas.microsoft.com/office/infopath/2007/PartnerControls">
-  <documentManagement/>
-</p:properties>
-</file>
-
 <file path=customXml/itemProps1.xml><?xml version="1.0" encoding="utf-8"?>
-<ds:datastoreItem xmlns:ds="http://schemas.openxmlformats.org/officeDocument/2006/customXml" ds:itemID="{388A559D-06CE-4B72-92BB-ECE7735BB26B}"/>
+<ds:datastoreItem xmlns:ds="http://schemas.openxmlformats.org/officeDocument/2006/customXml" ds:itemID="{62EAD858-C79C-46FB-AD0C-C6CD64543AEF}">
+  <ds:schemaRefs>
+    <ds:schemaRef ds:uri="http://schemas.microsoft.com/office/2006/metadata/properties"/>
+    <ds:schemaRef ds:uri="http://schemas.microsoft.com/office/infopath/2007/PartnerControls"/>
+  </ds:schemaRefs>
+</ds:datastoreItem>
 </file>
 
 <file path=customXml/itemProps2.xml><?xml version="1.0" encoding="utf-8"?>
-<ds:datastoreItem xmlns:ds="http://schemas.openxmlformats.org/officeDocument/2006/customXml" ds:itemID="{5889F277-4D0D-48DF-9DCE-57348EAF174A}"/>
+<ds:datastoreItem xmlns:ds="http://schemas.openxmlformats.org/officeDocument/2006/customXml" ds:itemID="{5889F277-4D0D-48DF-9DCE-57348EAF174A}">
+  <ds:schemaRefs>
+    <ds:schemaRef ds:uri="http://schemas.microsoft.com/sharepoint/v3/contenttype/forms"/>
+  </ds:schemaRefs>
+</ds:datastoreItem>
 </file>
 
 <file path=customXml/itemProps3.xml><?xml version="1.0" encoding="utf-8"?>
-<ds:datastoreItem xmlns:ds="http://schemas.openxmlformats.org/officeDocument/2006/customXml" ds:itemID="{62EAD858-C79C-46FB-AD0C-C6CD64543AEF}"/>
+<ds:datastoreItem xmlns:ds="http://schemas.openxmlformats.org/officeDocument/2006/customXml" ds:itemID="{388A559D-06CE-4B72-92BB-ECE7735BB26B}">
+  <ds:schemaRefs>
+    <ds:schemaRef ds:uri="http://schemas.microsoft.com/office/2006/metadata/contentType"/>
+    <ds:schemaRef ds:uri="http://schemas.microsoft.com/office/2006/metadata/properties/metaAttributes"/>
+    <ds:schemaRef ds:uri="http://www.w3.org/2001/XMLSchema"/>
+    <ds:schemaRef ds:uri="http://schemas.microsoft.com/office/2006/metadata/properties"/>
+    <ds:schemaRef ds:uri="987922cb-a795-4921-bf07-501f462bec56"/>
+    <ds:schemaRef ds:uri="http://schemas.microsoft.com/office/2006/documentManagement/types"/>
+    <ds:schemaRef ds:uri="http://schemas.microsoft.com/office/infopath/2007/PartnerControls"/>
+    <ds:schemaRef ds:uri="http://schemas.openxmlformats.org/package/2006/metadata/core-properties"/>
+    <ds:schemaRef ds:uri="http://purl.org/dc/elements/1.1/"/>
+    <ds:schemaRef ds:uri="http://purl.org/dc/terms/"/>
+    <ds:schemaRef ds:uri="http://schemas.microsoft.com/internal/obd"/>
+  </ds:schemaRefs>
+</ds:datastoreItem>
 </file>
</xml_diff>